<commit_message>
Phase 1 Done Add project configuration files and initial setup
- Create pyproject.toml for dependency management and project metadata
- Add pre-commit configuration for code linting
- Initialize requirements.txt for package dependencies
- Create conftest.py for test configuration
- Update Adaptive Financial Risk Intelligence Engine Roadmap with setup instructions
</commit_message>
<xml_diff>
--- a/Doc/Adaptive_Financial_Risk_Intelligence_Engine_Roadmap.docx
+++ b/Doc/Adaptive_Financial_Risk_Intelligence_Engine_Roadmap.docx
@@ -62,7 +62,15 @@
       </w:r>
       <w:r>
         <w:br/>
-        <w:t>3. Explains WHY the prediction was made.</w:t>
+        <w:t xml:space="preserve">3. </w:t>
+      </w:r>
+      <w:proofErr w:type="gramStart"/>
+      <w:r>
+        <w:t>Explains</w:t>
+      </w:r>
+      <w:proofErr w:type="gramEnd"/>
+      <w:r>
+        <w:t xml:space="preserve"> WHY the prediction was made.</w:t>
       </w:r>
       <w:r>
         <w:br/>
@@ -677,13 +685,27 @@
         <w:rPr>
           <w:rFonts w:hint="eastAsia"/>
         </w:rPr>
-        <w:t>├──</w:t>
-      </w:r>
+        <w:t>├─</w:t>
+      </w:r>
+      <w:proofErr w:type="gramStart"/>
       <w:r>
         <w:rPr>
           <w:rFonts w:hint="eastAsia"/>
         </w:rPr>
-        <w:t xml:space="preserve"> .github/</w:t>
+        <w:t>─</w:t>
+      </w:r>
+      <w:r>
+        <w:rPr>
+          <w:rFonts w:hint="eastAsia"/>
+        </w:rPr>
+        <w:t xml:space="preserve"> .github</w:t>
+      </w:r>
+      <w:proofErr w:type="gramEnd"/>
+      <w:r>
+        <w:rPr>
+          <w:rFonts w:hint="eastAsia"/>
+        </w:rPr>
+        <w:t>/</w:t>
       </w:r>
     </w:p>
     <w:p>
@@ -1057,8 +1079,16 @@
         <w:rPr>
           <w:rFonts w:hint="eastAsia"/>
         </w:rPr>
-        <w:t xml:space="preserve"> pyproject.toml</w:t>
-      </w:r>
+        <w:t xml:space="preserve"> </w:t>
+      </w:r>
+      <w:proofErr w:type="gramStart"/>
+      <w:r>
+        <w:rPr>
+          <w:rFonts w:hint="eastAsia"/>
+        </w:rPr>
+        <w:t>pyproject.toml</w:t>
+      </w:r>
+      <w:proofErr w:type="gramEnd"/>
     </w:p>
     <w:p>
       <w:pPr>
@@ -1209,24 +1239,210 @@
         <w:spacing w:after="120" w:line="240" w:lineRule="auto"/>
       </w:pPr>
       <w:r>
-        <w:t xml:space="preserve">Keep the eye on the </w:t>
-      </w:r>
-      <w:proofErr w:type="spellStart"/>
-      <w:r>
-        <w:t>StratifiedGroupKFold</w:t>
-      </w:r>
-      <w:proofErr w:type="spellEnd"/>
-      <w:r>
-        <w:t xml:space="preserve"> in </w:t>
-      </w:r>
-      <w:proofErr w:type="spellStart"/>
-      <w:r>
-        <w:t>sklearn</w:t>
-      </w:r>
-      <w:proofErr w:type="spellEnd"/>
-      <w:r>
-        <w:t xml:space="preserve"> for imbalance datasets.</w:t>
-      </w:r>
+        <w:t xml:space="preserve">Keep </w:t>
+      </w:r>
+      <w:proofErr w:type="gramStart"/>
+      <w:r>
+        <w:t>the</w:t>
+      </w:r>
+      <w:proofErr w:type="gramEnd"/>
+      <w:r>
+        <w:t xml:space="preserve"> eye on the StratifiedGroupKFold in sklearn for imbalance datasets.</w:t>
+      </w:r>
+    </w:p>
+    <w:p>
+      <w:pPr>
+        <w:spacing w:after="120" w:line="240" w:lineRule="auto"/>
+      </w:pPr>
+    </w:p>
+    <w:p>
+      <w:pPr>
+        <w:spacing w:after="120" w:line="240" w:lineRule="auto"/>
+      </w:pPr>
+    </w:p>
+    <w:p>
+      <w:pPr>
+        <w:pStyle w:val="Heading1"/>
+      </w:pPr>
+      <w:r>
+        <w:t>IMPORTANT</w:t>
+      </w:r>
+      <w:r>
+        <w:t xml:space="preserve"> Notes</w:t>
+      </w:r>
+    </w:p>
+    <w:p>
+      <w:r>
+        <w:t xml:space="preserve"> </w:t>
+      </w:r>
+    </w:p>
+    <w:p>
+      <w:pPr>
+        <w:pStyle w:val="Heading2"/>
+        <w:numPr>
+          <w:ilvl w:val="0"/>
+          <w:numId w:val="13"/>
+        </w:numPr>
+        <w:rPr>
+          <w:color w:val="EE0000"/>
+          <w:sz w:val="32"/>
+          <w:szCs w:val="32"/>
+        </w:rPr>
+      </w:pPr>
+      <w:r>
+        <w:rPr>
+          <w:color w:val="EE0000"/>
+          <w:sz w:val="32"/>
+          <w:szCs w:val="32"/>
+        </w:rPr>
+        <w:t xml:space="preserve">Set Up </w:t>
+      </w:r>
+      <w:proofErr w:type="gramStart"/>
+      <w:r>
+        <w:rPr>
+          <w:color w:val="EE0000"/>
+          <w:sz w:val="32"/>
+          <w:szCs w:val="32"/>
+        </w:rPr>
+        <w:t>pyproject.toml</w:t>
+      </w:r>
+      <w:proofErr w:type="gramEnd"/>
+      <w:r>
+        <w:rPr>
+          <w:color w:val="EE0000"/>
+          <w:sz w:val="32"/>
+          <w:szCs w:val="32"/>
+        </w:rPr>
+        <w:t xml:space="preserve"> – </w:t>
+      </w:r>
+      <w:r>
+        <w:rPr>
+          <w:b w:val="0"/>
+          <w:bCs w:val="0"/>
+          <w:color w:val="EE0000"/>
+          <w:sz w:val="28"/>
+          <w:szCs w:val="28"/>
+        </w:rPr>
+        <w:t>bold text is command</w:t>
+      </w:r>
+    </w:p>
+    <w:p>
+      <w:pPr>
+        <w:pStyle w:val="ListParagraph"/>
+        <w:numPr>
+          <w:ilvl w:val="0"/>
+          <w:numId w:val="14"/>
+        </w:numPr>
+      </w:pPr>
+      <w:r>
+        <w:rPr>
+          <w:b/>
+          <w:bCs/>
+        </w:rPr>
+        <w:t>poetry init</w:t>
+      </w:r>
+      <w:r>
+        <w:t xml:space="preserve"> – create the pyproject.toml file automatically</w:t>
+      </w:r>
+    </w:p>
+    <w:p>
+      <w:pPr>
+        <w:pStyle w:val="ListParagraph"/>
+        <w:numPr>
+          <w:ilvl w:val="0"/>
+          <w:numId w:val="14"/>
+        </w:numPr>
+        <w:rPr>
+          <w:b/>
+          <w:bCs/>
+        </w:rPr>
+      </w:pPr>
+      <w:r>
+        <w:t xml:space="preserve">Adding dependencies – </w:t>
+      </w:r>
+      <w:r>
+        <w:rPr>
+          <w:b/>
+          <w:bCs/>
+        </w:rPr>
+        <w:t>poetry add pandas scikit-learn dvc</w:t>
+      </w:r>
+    </w:p>
+    <w:p>
+      <w:pPr>
+        <w:pStyle w:val="ListParagraph"/>
+        <w:numPr>
+          <w:ilvl w:val="0"/>
+          <w:numId w:val="14"/>
+        </w:numPr>
+      </w:pPr>
+      <w:r>
+        <w:rPr>
+          <w:b/>
+          <w:bCs/>
+        </w:rPr>
+        <w:t>poetry lock</w:t>
+      </w:r>
+      <w:r>
+        <w:t xml:space="preserve"> – creates the poetry.lock file for reproducibility</w:t>
+      </w:r>
+    </w:p>
+    <w:p>
+      <w:pPr>
+        <w:pStyle w:val="ListParagraph"/>
+        <w:numPr>
+          <w:ilvl w:val="0"/>
+          <w:numId w:val="14"/>
+        </w:numPr>
+      </w:pPr>
+      <w:r>
+        <w:rPr>
+          <w:b/>
+          <w:bCs/>
+        </w:rPr>
+        <w:t>poetry install</w:t>
+      </w:r>
+      <w:r>
+        <w:t xml:space="preserve"> - Install everything</w:t>
+      </w:r>
+    </w:p>
+    <w:p>
+      <w:pPr>
+        <w:pStyle w:val="ListParagraph"/>
+        <w:numPr>
+          <w:ilvl w:val="0"/>
+          <w:numId w:val="14"/>
+        </w:numPr>
+        <w:rPr>
+          <w:b/>
+          <w:bCs/>
+        </w:rPr>
+      </w:pPr>
+      <w:r>
+        <w:t xml:space="preserve">Export requirements.txt to toml file: </w:t>
+      </w:r>
+      <w:r>
+        <w:rPr>
+          <w:b/>
+          <w:bCs/>
+        </w:rPr>
+        <w:t>poetry export -f requirements.txt --output requirements.txt</w:t>
+      </w:r>
+    </w:p>
+    <w:p>
+      <w:pPr>
+        <w:ind w:left="720"/>
+      </w:pPr>
+    </w:p>
+    <w:p>
+      <w:pPr>
+        <w:spacing w:after="120" w:line="240" w:lineRule="auto"/>
+      </w:pPr>
+    </w:p>
+    <w:p>
+      <w:pPr>
+        <w:spacing w:after="120" w:line="240" w:lineRule="auto"/>
+      </w:pPr>
     </w:p>
     <w:sectPr>
       <w:pgSz w:w="12240" w:h="15840"/>
@@ -1412,6 +1628,273 @@
     </w:lvl>
   </w:abstractNum>
   <w:abstractNum w:abstractNumId="9" w15:restartNumberingAfterBreak="0">
+    <w:nsid w:val="00043872"/>
+    <w:multiLevelType w:val="hybridMultilevel"/>
+    <w:tmpl w:val="CB504CA6"/>
+    <w:lvl w:ilvl="0" w:tplc="4009000F">
+      <w:start w:val="1"/>
+      <w:numFmt w:val="decimal"/>
+      <w:lvlText w:val="%1."/>
+      <w:lvlJc w:val="left"/>
+      <w:pPr>
+        <w:ind w:left="720" w:hanging="360"/>
+      </w:pPr>
+      <w:rPr>
+        <w:rFonts w:hint="default"/>
+      </w:rPr>
+    </w:lvl>
+    <w:lvl w:ilvl="1" w:tplc="40090019" w:tentative="1">
+      <w:start w:val="1"/>
+      <w:numFmt w:val="lowerLetter"/>
+      <w:lvlText w:val="%2."/>
+      <w:lvlJc w:val="left"/>
+      <w:pPr>
+        <w:ind w:left="1440" w:hanging="360"/>
+      </w:pPr>
+    </w:lvl>
+    <w:lvl w:ilvl="2" w:tplc="4009001B" w:tentative="1">
+      <w:start w:val="1"/>
+      <w:numFmt w:val="lowerRoman"/>
+      <w:lvlText w:val="%3."/>
+      <w:lvlJc w:val="right"/>
+      <w:pPr>
+        <w:ind w:left="2160" w:hanging="180"/>
+      </w:pPr>
+    </w:lvl>
+    <w:lvl w:ilvl="3" w:tplc="4009000F" w:tentative="1">
+      <w:start w:val="1"/>
+      <w:numFmt w:val="decimal"/>
+      <w:lvlText w:val="%4."/>
+      <w:lvlJc w:val="left"/>
+      <w:pPr>
+        <w:ind w:left="2880" w:hanging="360"/>
+      </w:pPr>
+    </w:lvl>
+    <w:lvl w:ilvl="4" w:tplc="40090019" w:tentative="1">
+      <w:start w:val="1"/>
+      <w:numFmt w:val="lowerLetter"/>
+      <w:lvlText w:val="%5."/>
+      <w:lvlJc w:val="left"/>
+      <w:pPr>
+        <w:ind w:left="3600" w:hanging="360"/>
+      </w:pPr>
+    </w:lvl>
+    <w:lvl w:ilvl="5" w:tplc="4009001B" w:tentative="1">
+      <w:start w:val="1"/>
+      <w:numFmt w:val="lowerRoman"/>
+      <w:lvlText w:val="%6."/>
+      <w:lvlJc w:val="right"/>
+      <w:pPr>
+        <w:ind w:left="4320" w:hanging="180"/>
+      </w:pPr>
+    </w:lvl>
+    <w:lvl w:ilvl="6" w:tplc="4009000F" w:tentative="1">
+      <w:start w:val="1"/>
+      <w:numFmt w:val="decimal"/>
+      <w:lvlText w:val="%7."/>
+      <w:lvlJc w:val="left"/>
+      <w:pPr>
+        <w:ind w:left="5040" w:hanging="360"/>
+      </w:pPr>
+    </w:lvl>
+    <w:lvl w:ilvl="7" w:tplc="40090019" w:tentative="1">
+      <w:start w:val="1"/>
+      <w:numFmt w:val="lowerLetter"/>
+      <w:lvlText w:val="%8."/>
+      <w:lvlJc w:val="left"/>
+      <w:pPr>
+        <w:ind w:left="5760" w:hanging="360"/>
+      </w:pPr>
+    </w:lvl>
+    <w:lvl w:ilvl="8" w:tplc="4009001B" w:tentative="1">
+      <w:start w:val="1"/>
+      <w:numFmt w:val="lowerRoman"/>
+      <w:lvlText w:val="%9."/>
+      <w:lvlJc w:val="right"/>
+      <w:pPr>
+        <w:ind w:left="6480" w:hanging="180"/>
+      </w:pPr>
+    </w:lvl>
+  </w:abstractNum>
+  <w:abstractNum w:abstractNumId="10" w15:restartNumberingAfterBreak="0">
+    <w:nsid w:val="064B2714"/>
+    <w:multiLevelType w:val="hybridMultilevel"/>
+    <w:tmpl w:val="C3F65520"/>
+    <w:lvl w:ilvl="0" w:tplc="4009000F">
+      <w:start w:val="1"/>
+      <w:numFmt w:val="decimal"/>
+      <w:lvlText w:val="%1."/>
+      <w:lvlJc w:val="left"/>
+      <w:pPr>
+        <w:ind w:left="720" w:hanging="360"/>
+      </w:pPr>
+      <w:rPr>
+        <w:rFonts w:hint="default"/>
+      </w:rPr>
+    </w:lvl>
+    <w:lvl w:ilvl="1" w:tplc="40090019">
+      <w:start w:val="1"/>
+      <w:numFmt w:val="lowerLetter"/>
+      <w:lvlText w:val="%2."/>
+      <w:lvlJc w:val="left"/>
+      <w:pPr>
+        <w:ind w:left="1440" w:hanging="360"/>
+      </w:pPr>
+    </w:lvl>
+    <w:lvl w:ilvl="2" w:tplc="4009001B" w:tentative="1">
+      <w:start w:val="1"/>
+      <w:numFmt w:val="lowerRoman"/>
+      <w:lvlText w:val="%3."/>
+      <w:lvlJc w:val="right"/>
+      <w:pPr>
+        <w:ind w:left="2160" w:hanging="180"/>
+      </w:pPr>
+    </w:lvl>
+    <w:lvl w:ilvl="3" w:tplc="4009000F" w:tentative="1">
+      <w:start w:val="1"/>
+      <w:numFmt w:val="decimal"/>
+      <w:lvlText w:val="%4."/>
+      <w:lvlJc w:val="left"/>
+      <w:pPr>
+        <w:ind w:left="2880" w:hanging="360"/>
+      </w:pPr>
+    </w:lvl>
+    <w:lvl w:ilvl="4" w:tplc="40090019" w:tentative="1">
+      <w:start w:val="1"/>
+      <w:numFmt w:val="lowerLetter"/>
+      <w:lvlText w:val="%5."/>
+      <w:lvlJc w:val="left"/>
+      <w:pPr>
+        <w:ind w:left="3600" w:hanging="360"/>
+      </w:pPr>
+    </w:lvl>
+    <w:lvl w:ilvl="5" w:tplc="4009001B" w:tentative="1">
+      <w:start w:val="1"/>
+      <w:numFmt w:val="lowerRoman"/>
+      <w:lvlText w:val="%6."/>
+      <w:lvlJc w:val="right"/>
+      <w:pPr>
+        <w:ind w:left="4320" w:hanging="180"/>
+      </w:pPr>
+    </w:lvl>
+    <w:lvl w:ilvl="6" w:tplc="4009000F" w:tentative="1">
+      <w:start w:val="1"/>
+      <w:numFmt w:val="decimal"/>
+      <w:lvlText w:val="%7."/>
+      <w:lvlJc w:val="left"/>
+      <w:pPr>
+        <w:ind w:left="5040" w:hanging="360"/>
+      </w:pPr>
+    </w:lvl>
+    <w:lvl w:ilvl="7" w:tplc="40090019" w:tentative="1">
+      <w:start w:val="1"/>
+      <w:numFmt w:val="lowerLetter"/>
+      <w:lvlText w:val="%8."/>
+      <w:lvlJc w:val="left"/>
+      <w:pPr>
+        <w:ind w:left="5760" w:hanging="360"/>
+      </w:pPr>
+    </w:lvl>
+    <w:lvl w:ilvl="8" w:tplc="4009001B" w:tentative="1">
+      <w:start w:val="1"/>
+      <w:numFmt w:val="lowerRoman"/>
+      <w:lvlText w:val="%9."/>
+      <w:lvlJc w:val="right"/>
+      <w:pPr>
+        <w:ind w:left="6480" w:hanging="180"/>
+      </w:pPr>
+    </w:lvl>
+  </w:abstractNum>
+  <w:abstractNum w:abstractNumId="11" w15:restartNumberingAfterBreak="0">
+    <w:nsid w:val="0DDA278F"/>
+    <w:multiLevelType w:val="hybridMultilevel"/>
+    <w:tmpl w:val="D78E0F0E"/>
+    <w:lvl w:ilvl="0" w:tplc="4009000F">
+      <w:start w:val="1"/>
+      <w:numFmt w:val="decimal"/>
+      <w:lvlText w:val="%1."/>
+      <w:lvlJc w:val="left"/>
+      <w:pPr>
+        <w:ind w:left="720" w:hanging="360"/>
+      </w:pPr>
+      <w:rPr>
+        <w:rFonts w:hint="default"/>
+      </w:rPr>
+    </w:lvl>
+    <w:lvl w:ilvl="1" w:tplc="40090019" w:tentative="1">
+      <w:start w:val="1"/>
+      <w:numFmt w:val="lowerLetter"/>
+      <w:lvlText w:val="%2."/>
+      <w:lvlJc w:val="left"/>
+      <w:pPr>
+        <w:ind w:left="1440" w:hanging="360"/>
+      </w:pPr>
+    </w:lvl>
+    <w:lvl w:ilvl="2" w:tplc="4009001B" w:tentative="1">
+      <w:start w:val="1"/>
+      <w:numFmt w:val="lowerRoman"/>
+      <w:lvlText w:val="%3."/>
+      <w:lvlJc w:val="right"/>
+      <w:pPr>
+        <w:ind w:left="2160" w:hanging="180"/>
+      </w:pPr>
+    </w:lvl>
+    <w:lvl w:ilvl="3" w:tplc="4009000F" w:tentative="1">
+      <w:start w:val="1"/>
+      <w:numFmt w:val="decimal"/>
+      <w:lvlText w:val="%4."/>
+      <w:lvlJc w:val="left"/>
+      <w:pPr>
+        <w:ind w:left="2880" w:hanging="360"/>
+      </w:pPr>
+    </w:lvl>
+    <w:lvl w:ilvl="4" w:tplc="40090019" w:tentative="1">
+      <w:start w:val="1"/>
+      <w:numFmt w:val="lowerLetter"/>
+      <w:lvlText w:val="%5."/>
+      <w:lvlJc w:val="left"/>
+      <w:pPr>
+        <w:ind w:left="3600" w:hanging="360"/>
+      </w:pPr>
+    </w:lvl>
+    <w:lvl w:ilvl="5" w:tplc="4009001B" w:tentative="1">
+      <w:start w:val="1"/>
+      <w:numFmt w:val="lowerRoman"/>
+      <w:lvlText w:val="%6."/>
+      <w:lvlJc w:val="right"/>
+      <w:pPr>
+        <w:ind w:left="4320" w:hanging="180"/>
+      </w:pPr>
+    </w:lvl>
+    <w:lvl w:ilvl="6" w:tplc="4009000F" w:tentative="1">
+      <w:start w:val="1"/>
+      <w:numFmt w:val="decimal"/>
+      <w:lvlText w:val="%7."/>
+      <w:lvlJc w:val="left"/>
+      <w:pPr>
+        <w:ind w:left="5040" w:hanging="360"/>
+      </w:pPr>
+    </w:lvl>
+    <w:lvl w:ilvl="7" w:tplc="40090019" w:tentative="1">
+      <w:start w:val="1"/>
+      <w:numFmt w:val="lowerLetter"/>
+      <w:lvlText w:val="%8."/>
+      <w:lvlJc w:val="left"/>
+      <w:pPr>
+        <w:ind w:left="5760" w:hanging="360"/>
+      </w:pPr>
+    </w:lvl>
+    <w:lvl w:ilvl="8" w:tplc="4009001B" w:tentative="1">
+      <w:start w:val="1"/>
+      <w:numFmt w:val="lowerRoman"/>
+      <w:lvlText w:val="%9."/>
+      <w:lvlJc w:val="right"/>
+      <w:pPr>
+        <w:ind w:left="6480" w:hanging="180"/>
+      </w:pPr>
+    </w:lvl>
+  </w:abstractNum>
+  <w:abstractNum w:abstractNumId="12" w15:restartNumberingAfterBreak="0">
     <w:nsid w:val="165E40B1"/>
     <w:multiLevelType w:val="hybridMultilevel"/>
     <w:tmpl w:val="AB64CCC0"/>
@@ -1497,6 +1980,95 @@
       <w:lvlJc w:val="right"/>
       <w:pPr>
         <w:ind w:left="6480" w:hanging="180"/>
+      </w:pPr>
+    </w:lvl>
+  </w:abstractNum>
+  <w:abstractNum w:abstractNumId="13" w15:restartNumberingAfterBreak="0">
+    <w:nsid w:val="779B51C7"/>
+    <w:multiLevelType w:val="hybridMultilevel"/>
+    <w:tmpl w:val="9FDEB194"/>
+    <w:lvl w:ilvl="0" w:tplc="F4702AD6">
+      <w:start w:val="1"/>
+      <w:numFmt w:val="decimal"/>
+      <w:lvlText w:val="%1."/>
+      <w:lvlJc w:val="left"/>
+      <w:pPr>
+        <w:ind w:left="1080" w:hanging="360"/>
+      </w:pPr>
+      <w:rPr>
+        <w:rFonts w:hint="default"/>
+      </w:rPr>
+    </w:lvl>
+    <w:lvl w:ilvl="1" w:tplc="40090019" w:tentative="1">
+      <w:start w:val="1"/>
+      <w:numFmt w:val="lowerLetter"/>
+      <w:lvlText w:val="%2."/>
+      <w:lvlJc w:val="left"/>
+      <w:pPr>
+        <w:ind w:left="1800" w:hanging="360"/>
+      </w:pPr>
+    </w:lvl>
+    <w:lvl w:ilvl="2" w:tplc="4009001B" w:tentative="1">
+      <w:start w:val="1"/>
+      <w:numFmt w:val="lowerRoman"/>
+      <w:lvlText w:val="%3."/>
+      <w:lvlJc w:val="right"/>
+      <w:pPr>
+        <w:ind w:left="2520" w:hanging="180"/>
+      </w:pPr>
+    </w:lvl>
+    <w:lvl w:ilvl="3" w:tplc="4009000F" w:tentative="1">
+      <w:start w:val="1"/>
+      <w:numFmt w:val="decimal"/>
+      <w:lvlText w:val="%4."/>
+      <w:lvlJc w:val="left"/>
+      <w:pPr>
+        <w:ind w:left="3240" w:hanging="360"/>
+      </w:pPr>
+    </w:lvl>
+    <w:lvl w:ilvl="4" w:tplc="40090019" w:tentative="1">
+      <w:start w:val="1"/>
+      <w:numFmt w:val="lowerLetter"/>
+      <w:lvlText w:val="%5."/>
+      <w:lvlJc w:val="left"/>
+      <w:pPr>
+        <w:ind w:left="3960" w:hanging="360"/>
+      </w:pPr>
+    </w:lvl>
+    <w:lvl w:ilvl="5" w:tplc="4009001B" w:tentative="1">
+      <w:start w:val="1"/>
+      <w:numFmt w:val="lowerRoman"/>
+      <w:lvlText w:val="%6."/>
+      <w:lvlJc w:val="right"/>
+      <w:pPr>
+        <w:ind w:left="4680" w:hanging="180"/>
+      </w:pPr>
+    </w:lvl>
+    <w:lvl w:ilvl="6" w:tplc="4009000F" w:tentative="1">
+      <w:start w:val="1"/>
+      <w:numFmt w:val="decimal"/>
+      <w:lvlText w:val="%7."/>
+      <w:lvlJc w:val="left"/>
+      <w:pPr>
+        <w:ind w:left="5400" w:hanging="360"/>
+      </w:pPr>
+    </w:lvl>
+    <w:lvl w:ilvl="7" w:tplc="40090019" w:tentative="1">
+      <w:start w:val="1"/>
+      <w:numFmt w:val="lowerLetter"/>
+      <w:lvlText w:val="%8."/>
+      <w:lvlJc w:val="left"/>
+      <w:pPr>
+        <w:ind w:left="6120" w:hanging="360"/>
+      </w:pPr>
+    </w:lvl>
+    <w:lvl w:ilvl="8" w:tplc="4009001B" w:tentative="1">
+      <w:start w:val="1"/>
+      <w:numFmt w:val="lowerRoman"/>
+      <w:lvlText w:val="%9."/>
+      <w:lvlJc w:val="right"/>
+      <w:pPr>
+        <w:ind w:left="6840" w:hanging="180"/>
       </w:pPr>
     </w:lvl>
   </w:abstractNum>
@@ -1528,7 +2100,19 @@
     <w:abstractNumId w:val="0"/>
   </w:num>
   <w:num w:numId="10" w16cid:durableId="1624769160">
+    <w:abstractNumId w:val="12"/>
+  </w:num>
+  <w:num w:numId="11" w16cid:durableId="380251214">
     <w:abstractNumId w:val="9"/>
+  </w:num>
+  <w:num w:numId="12" w16cid:durableId="2053917119">
+    <w:abstractNumId w:val="10"/>
+  </w:num>
+  <w:num w:numId="13" w16cid:durableId="299581623">
+    <w:abstractNumId w:val="11"/>
+  </w:num>
+  <w:num w:numId="14" w16cid:durableId="1563298065">
+    <w:abstractNumId w:val="13"/>
   </w:num>
 </w:numbering>
 </file>

</xml_diff>

<commit_message>
Add database connection and CSV to postgres Database loading functionality
</commit_message>
<xml_diff>
--- a/Doc/Adaptive_Financial_Risk_Intelligence_Engine_Roadmap.docx
+++ b/Doc/Adaptive_Financial_Risk_Intelligence_Engine_Roadmap.docx
@@ -35,16 +35,8 @@
     <w:p>
       <w:pPr>
         <w:pStyle w:val="Heading2"/>
-        <w:rPr>
-          <w:sz w:val="32"/>
-          <w:szCs w:val="32"/>
-        </w:rPr>
-      </w:pPr>
-      <w:r>
-        <w:rPr>
-          <w:sz w:val="32"/>
-          <w:szCs w:val="32"/>
-        </w:rPr>
+      </w:pPr>
+      <w:r>
         <w:t>Project Goal</w:t>
       </w:r>
     </w:p>
@@ -110,16 +102,8 @@
     <w:p>
       <w:pPr>
         <w:pStyle w:val="Heading2"/>
-        <w:rPr>
-          <w:sz w:val="32"/>
-          <w:szCs w:val="32"/>
-        </w:rPr>
-      </w:pPr>
-      <w:r>
-        <w:rPr>
-          <w:sz w:val="32"/>
-          <w:szCs w:val="32"/>
-        </w:rPr>
+      </w:pPr>
+      <w:r>
         <w:t>Architecture Decisions</w:t>
       </w:r>
     </w:p>
@@ -151,36 +135,48 @@
     <w:p>
       <w:pPr>
         <w:pStyle w:val="Heading2"/>
-        <w:rPr>
-          <w:sz w:val="32"/>
-          <w:szCs w:val="32"/>
-        </w:rPr>
-      </w:pPr>
-      <w:r>
-        <w:rPr>
-          <w:sz w:val="32"/>
-          <w:szCs w:val="32"/>
-        </w:rPr>
+      </w:pPr>
+      <w:r>
         <w:t>Implementation Roadmap</w:t>
       </w:r>
     </w:p>
     <w:p>
-      <w:r>
+      <w:pPr>
+        <w:rPr>
+          <w:color w:val="E36C0A" w:themeColor="accent6" w:themeShade="BF"/>
+        </w:rPr>
+      </w:pPr>
+      <w:r>
+        <w:rPr>
+          <w:color w:val="E36C0A" w:themeColor="accent6" w:themeShade="BF"/>
+        </w:rPr>
         <w:t>Phase 1 – Repository Setup</w:t>
       </w:r>
       <w:r>
+        <w:rPr>
+          <w:color w:val="E36C0A" w:themeColor="accent6" w:themeShade="BF"/>
+        </w:rPr>
         <w:br/>
         <w:t>- Create repository</w:t>
       </w:r>
       <w:r>
+        <w:rPr>
+          <w:color w:val="E36C0A" w:themeColor="accent6" w:themeShade="BF"/>
+        </w:rPr>
         <w:br/>
         <w:t>- Configure virtual environment</w:t>
       </w:r>
       <w:r>
+        <w:rPr>
+          <w:color w:val="E36C0A" w:themeColor="accent6" w:themeShade="BF"/>
+        </w:rPr>
         <w:br/>
         <w:t>- Configure linting/testing/logging</w:t>
       </w:r>
       <w:r>
+        <w:rPr>
+          <w:color w:val="E36C0A" w:themeColor="accent6" w:themeShade="BF"/>
+        </w:rPr>
         <w:br/>
         <w:t>- Create folder structure</w:t>
       </w:r>
@@ -391,203 +387,195 @@
         <w:br/>
         <w:t>- Logging</w:t>
       </w:r>
+      <w:r>
+        <w:br/>
+      </w:r>
+      <w:r>
+        <w:br/>
+        <w:t>Phase 11 – Feature Storage</w:t>
+      </w:r>
+      <w:r>
+        <w:br/>
+        <w:t>- PostgreSQL for history</w:t>
+      </w:r>
+      <w:r>
+        <w:br/>
+        <w:t>- Redis cache for low-latency serving</w:t>
+      </w:r>
+      <w:r>
+        <w:br/>
+      </w:r>
+      <w:r>
+        <w:br/>
+        <w:t>Phase 12 – Airflow</w:t>
+      </w:r>
+      <w:r>
+        <w:br/>
+        <w:t>- DAG:</w:t>
+      </w:r>
+      <w:r>
+        <w:br/>
+        <w:t xml:space="preserve">  Validate → Feature Engineering → Train → Evaluate → Register</w:t>
+      </w:r>
+      <w:r>
+        <w:br/>
+      </w:r>
+      <w:r>
+        <w:br/>
+        <w:t>Phase 13 – Monitoring</w:t>
+      </w:r>
+      <w:r>
+        <w:br/>
+        <w:t>- Evidently AI</w:t>
+      </w:r>
+      <w:r>
+        <w:br/>
+        <w:t>- Data drift</w:t>
+      </w:r>
+      <w:r>
+        <w:br/>
+        <w:t>- Prediction monitoring</w:t>
+      </w:r>
+      <w:r>
+        <w:br/>
+      </w:r>
+      <w:r>
+        <w:br/>
+        <w:t>Phase 14 – Retraining</w:t>
+      </w:r>
+      <w:r>
+        <w:br/>
+        <w:t>- Trigger on drift</w:t>
+      </w:r>
+      <w:r>
+        <w:br/>
+        <w:t>- Retrain</w:t>
+      </w:r>
+      <w:r>
+        <w:br/>
+        <w:t>- Champion/Challenger comparison</w:t>
+      </w:r>
+      <w:r>
+        <w:br/>
+        <w:t>- Promote if improved</w:t>
+      </w:r>
+      <w:r>
+        <w:br/>
+      </w:r>
+      <w:r>
+        <w:br/>
+        <w:t>Phase 15 – Containerization</w:t>
+      </w:r>
+      <w:r>
+        <w:br/>
+        <w:t>- Docker</w:t>
+      </w:r>
+      <w:r>
+        <w:br/>
+        <w:t>- Docker Compose</w:t>
+      </w:r>
+      <w:r>
+        <w:br/>
+      </w:r>
+      <w:r>
+        <w:br/>
+        <w:t>Phase 16 – Infrastructure</w:t>
+      </w:r>
+      <w:r>
+        <w:br/>
+        <w:t>- Terraform</w:t>
+      </w:r>
+      <w:r>
+        <w:br/>
+        <w:t>- AWS S3</w:t>
+      </w:r>
+      <w:r>
+        <w:br/>
+        <w:t>- AWS ECR</w:t>
+      </w:r>
+      <w:r>
+        <w:br/>
+        <w:t>- AWS RDS</w:t>
+      </w:r>
+      <w:r>
+        <w:br/>
+        <w:t>- IAM</w:t>
+      </w:r>
+      <w:r>
+        <w:br/>
+      </w:r>
+      <w:r>
+        <w:br/>
+        <w:t>Phase 17 – Deployment</w:t>
+      </w:r>
+      <w:r>
+        <w:br/>
+        <w:t>- Kubernetes (kind/minikube)</w:t>
+      </w:r>
+      <w:r>
+        <w:br/>
+        <w:t>- Optional AWS deployment</w:t>
+      </w:r>
+      <w:r>
+        <w:br/>
+      </w:r>
     </w:p>
     <w:p>
       <w:r>
+        <w:t>Phase 18 – CI/CD</w:t>
+      </w:r>
+      <w:r>
         <w:br/>
+        <w:t>- GitHub Actions</w:t>
       </w:r>
       <w:r>
         <w:br/>
-        <w:t>Phase 11 – Feature Storage</w:t>
+        <w:t>- Test</w:t>
       </w:r>
       <w:r>
         <w:br/>
-        <w:t>- PostgreSQL for history</w:t>
+      </w:r>
+      <w:r>
+        <w:lastRenderedPageBreak/>
+        <w:t>- Build</w:t>
       </w:r>
       <w:r>
         <w:br/>
-        <w:t>- Redis cache for low-latency serving</w:t>
+        <w:t>- Push image</w:t>
       </w:r>
       <w:r>
         <w:br/>
+        <w:t>- Deploy</w:t>
       </w:r>
       <w:r>
         <w:br/>
-        <w:t>Phase 12 – Airflow</w:t>
       </w:r>
       <w:r>
         <w:br/>
-        <w:t>- DAG:</w:t>
+        <w:t>Phase 19 – Documentation</w:t>
       </w:r>
       <w:r>
         <w:br/>
-        <w:t xml:space="preserve">  Validate → Feature Engineering → Train → Evaluate → Register</w:t>
+        <w:t>- README</w:t>
       </w:r>
       <w:r>
         <w:br/>
+        <w:t>- Architecture diagrams</w:t>
       </w:r>
       <w:r>
         <w:br/>
-        <w:t>Phase 13 – Monitoring</w:t>
+        <w:t>- API docs</w:t>
       </w:r>
       <w:r>
         <w:br/>
-        <w:t>- Evidently AI</w:t>
-      </w:r>
-      <w:r>
-        <w:br/>
-        <w:t>- Data drift</w:t>
-      </w:r>
-      <w:r>
-        <w:br/>
-        <w:t>- Prediction monitoring</w:t>
-      </w:r>
-      <w:r>
-        <w:br/>
-      </w:r>
-      <w:r>
-        <w:br/>
-        <w:t>Phase 14 – Retraining</w:t>
-      </w:r>
-      <w:r>
-        <w:br/>
-        <w:t>- Trigger on drift</w:t>
-      </w:r>
-      <w:r>
-        <w:br/>
-        <w:t>- Retrain</w:t>
-      </w:r>
-      <w:r>
-        <w:br/>
-        <w:t>- Champion/Challenger comparison</w:t>
-      </w:r>
-      <w:r>
-        <w:br/>
-        <w:t>- Promote if improved</w:t>
-      </w:r>
-      <w:r>
-        <w:br/>
-      </w:r>
-      <w:r>
-        <w:br/>
-        <w:t>Phase 15 – Containerization</w:t>
-      </w:r>
-      <w:r>
-        <w:br/>
-        <w:t>- Docker</w:t>
-      </w:r>
-      <w:r>
-        <w:br/>
-        <w:t>- Docker Compose</w:t>
-      </w:r>
-      <w:r>
-        <w:br/>
-      </w:r>
-      <w:r>
-        <w:br/>
-        <w:t>Phase 16 – Infrastructure</w:t>
-      </w:r>
-      <w:r>
-        <w:br/>
-        <w:t>- Terraform</w:t>
-      </w:r>
-      <w:r>
-        <w:br/>
-        <w:t>- AWS S3</w:t>
-      </w:r>
-      <w:r>
-        <w:br/>
-        <w:t>- AWS ECR</w:t>
-      </w:r>
-      <w:r>
-        <w:br/>
-        <w:t>- AWS RDS</w:t>
-      </w:r>
-      <w:r>
-        <w:br/>
-        <w:t>- IAM</w:t>
-      </w:r>
-      <w:r>
-        <w:br/>
-      </w:r>
-      <w:r>
-        <w:br/>
-        <w:t>Phase 17 – Deployment</w:t>
-      </w:r>
-      <w:r>
-        <w:br/>
-        <w:t>- Kubernetes (kind/minikube)</w:t>
-      </w:r>
-      <w:r>
-        <w:br/>
-        <w:t>- Optional AWS deployment</w:t>
-      </w:r>
-      <w:r>
-        <w:br/>
+        <w:t>- Interview notes</w:t>
       </w:r>
     </w:p>
     <w:p>
-      <w:r>
-        <w:lastRenderedPageBreak/>
-        <w:t>Phase 18 – CI/CD</w:t>
-      </w:r>
-      <w:r>
-        <w:br/>
-        <w:t>- GitHub Actions</w:t>
-      </w:r>
-      <w:r>
-        <w:br/>
-        <w:t>- Test</w:t>
-      </w:r>
-      <w:r>
-        <w:br/>
-        <w:t>- Build</w:t>
-      </w:r>
-      <w:r>
-        <w:br/>
-        <w:t>- Push image</w:t>
-      </w:r>
-      <w:r>
-        <w:br/>
-        <w:t>- Deploy</w:t>
-      </w:r>
-      <w:r>
-        <w:br/>
-      </w:r>
-      <w:r>
-        <w:br/>
-        <w:t>Phase 19 – Documentation</w:t>
-      </w:r>
-      <w:r>
-        <w:br/>
-        <w:t>- README</w:t>
-      </w:r>
-      <w:r>
-        <w:br/>
-        <w:t>- Architecture diagrams</w:t>
-      </w:r>
-      <w:r>
-        <w:br/>
-        <w:t>- API docs</w:t>
-      </w:r>
-      <w:r>
-        <w:br/>
-        <w:t>- Interview notes</w:t>
-      </w:r>
-    </w:p>
-    <w:p>
       <w:pPr>
         <w:pStyle w:val="Heading2"/>
-        <w:rPr>
-          <w:sz w:val="32"/>
-          <w:szCs w:val="32"/>
-        </w:rPr>
-      </w:pPr>
-      <w:r>
-        <w:rPr>
-          <w:sz w:val="32"/>
-          <w:szCs w:val="32"/>
-        </w:rPr>
+      </w:pPr>
+      <w:r>
         <w:t>Success Criteria</w:t>
       </w:r>
     </w:p>
@@ -1167,8 +1155,14 @@
     <w:p>
       <w:pPr>
         <w:pStyle w:val="Heading1"/>
-      </w:pPr>
-      <w:r>
+        <w:rPr>
+          <w:color w:val="EE0000"/>
+        </w:rPr>
+      </w:pPr>
+      <w:r>
+        <w:rPr>
+          <w:color w:val="EE0000"/>
+        </w:rPr>
         <w:lastRenderedPageBreak/>
         <w:t xml:space="preserve">IMPORTANT THINGS </w:t>
       </w:r>
@@ -1257,73 +1251,229 @@
     </w:p>
     <w:p>
       <w:pPr>
-        <w:spacing w:after="120" w:line="240" w:lineRule="auto"/>
-      </w:pPr>
+        <w:pStyle w:val="Heading1"/>
+      </w:pPr>
+      <w:r>
+        <w:t>Database information</w:t>
+      </w:r>
+    </w:p>
+    <w:p/>
+    <w:p>
+      <w:r>
+        <w:rPr>
+          <w:b/>
+          <w:bCs/>
+        </w:rPr>
+        <w:t>Database name</w:t>
+      </w:r>
+      <w:r>
+        <w:t>: fraud_risk</w:t>
+      </w:r>
     </w:p>
     <w:p>
-      <w:pPr>
-        <w:pStyle w:val="Heading1"/>
-      </w:pPr>
-      <w:r>
-        <w:t>IMPORTANT</w:t>
-      </w:r>
-      <w:r>
-        <w:t xml:space="preserve"> Notes</w:t>
+      <w:r>
+        <w:rPr>
+          <w:b/>
+          <w:bCs/>
+        </w:rPr>
+        <w:t>user:</w:t>
+      </w:r>
+      <w:r>
+        <w:t xml:space="preserve"> fraud_user</w:t>
       </w:r>
     </w:p>
     <w:p>
       <w:r>
-        <w:t xml:space="preserve"> </w:t>
+        <w:rPr>
+          <w:b/>
+          <w:bCs/>
+        </w:rPr>
+        <w:t>password:</w:t>
+      </w:r>
+      <w:r>
+        <w:t xml:space="preserve"> admin</w:t>
       </w:r>
     </w:p>
     <w:p>
+      <w:r>
+        <w:rPr>
+          <w:b/>
+          <w:bCs/>
+        </w:rPr>
+        <w:t>Privileges:</w:t>
+      </w:r>
+      <w:r>
+        <w:t xml:space="preserve"> sudo</w:t>
+      </w:r>
+      <w:r>
+        <w:t xml:space="preserve"> -u postgres psql -c "GRANT ALL PRIVILEGES ON DATABASE fraud_risk TO fraud_user;"</w:t>
+      </w:r>
+    </w:p>
+    <w:p>
+      <w:pPr>
+        <w:spacing w:after="120" w:line="240" w:lineRule="auto"/>
+      </w:pPr>
+    </w:p>
+    <w:p>
+      <w:pPr>
+        <w:spacing w:after="120" w:line="240" w:lineRule="auto"/>
+      </w:pPr>
+    </w:p>
+    <w:p>
+      <w:pPr>
+        <w:spacing w:after="120" w:line="240" w:lineRule="auto"/>
+      </w:pPr>
+    </w:p>
+    <w:p>
+      <w:pPr>
+        <w:spacing w:after="120" w:line="240" w:lineRule="auto"/>
+      </w:pPr>
+    </w:p>
+    <w:p>
+      <w:pPr>
+        <w:spacing w:after="120" w:line="240" w:lineRule="auto"/>
+      </w:pPr>
+    </w:p>
+    <w:p>
+      <w:pPr>
+        <w:spacing w:after="120" w:line="240" w:lineRule="auto"/>
+      </w:pPr>
+    </w:p>
+    <w:p>
+      <w:pPr>
+        <w:spacing w:after="120" w:line="240" w:lineRule="auto"/>
+      </w:pPr>
+    </w:p>
+    <w:p>
+      <w:pPr>
+        <w:spacing w:after="120" w:line="240" w:lineRule="auto"/>
+      </w:pPr>
+    </w:p>
+    <w:p>
+      <w:pPr>
+        <w:spacing w:after="120" w:line="240" w:lineRule="auto"/>
+      </w:pPr>
+    </w:p>
+    <w:p>
+      <w:pPr>
+        <w:spacing w:after="120" w:line="240" w:lineRule="auto"/>
+      </w:pPr>
+    </w:p>
+    <w:p>
+      <w:pPr>
+        <w:spacing w:after="120" w:line="240" w:lineRule="auto"/>
+      </w:pPr>
+    </w:p>
+    <w:p>
+      <w:pPr>
+        <w:spacing w:after="120" w:line="240" w:lineRule="auto"/>
+      </w:pPr>
+    </w:p>
+    <w:p>
+      <w:pPr>
+        <w:spacing w:after="120" w:line="240" w:lineRule="auto"/>
+      </w:pPr>
+    </w:p>
+    <w:p>
+      <w:pPr>
+        <w:spacing w:after="120" w:line="240" w:lineRule="auto"/>
+      </w:pPr>
+    </w:p>
+    <w:p>
+      <w:pPr>
+        <w:spacing w:after="120" w:line="240" w:lineRule="auto"/>
+      </w:pPr>
+    </w:p>
+    <w:p>
+      <w:pPr>
+        <w:spacing w:after="120" w:line="240" w:lineRule="auto"/>
+      </w:pPr>
+    </w:p>
+    <w:p>
+      <w:pPr>
+        <w:spacing w:after="120" w:line="240" w:lineRule="auto"/>
+      </w:pPr>
+    </w:p>
+    <w:p>
+      <w:pPr>
+        <w:spacing w:after="120" w:line="240" w:lineRule="auto"/>
+      </w:pPr>
+    </w:p>
+    <w:p>
+      <w:pPr>
+        <w:spacing w:after="120" w:line="240" w:lineRule="auto"/>
+      </w:pPr>
+    </w:p>
+    <w:p>
+      <w:pPr>
+        <w:spacing w:after="120" w:line="240" w:lineRule="auto"/>
+      </w:pPr>
+    </w:p>
+    <w:p>
+      <w:pPr>
+        <w:spacing w:after="120" w:line="240" w:lineRule="auto"/>
+      </w:pPr>
+    </w:p>
+    <w:p>
+      <w:pPr>
+        <w:spacing w:after="120" w:line="240" w:lineRule="auto"/>
+      </w:pPr>
+    </w:p>
+    <w:p>
+      <w:pPr>
+        <w:spacing w:after="120" w:line="240" w:lineRule="auto"/>
+      </w:pPr>
+    </w:p>
+    <w:p>
+      <w:pPr>
+        <w:spacing w:after="120" w:line="240" w:lineRule="auto"/>
+      </w:pPr>
+    </w:p>
+    <w:p>
+      <w:pPr>
+        <w:spacing w:after="120" w:line="240" w:lineRule="auto"/>
+      </w:pPr>
+    </w:p>
+    <w:p>
+      <w:pPr>
+        <w:spacing w:after="120" w:line="240" w:lineRule="auto"/>
+      </w:pPr>
+    </w:p>
+    <w:p>
+      <w:pPr>
+        <w:spacing w:after="120" w:line="240" w:lineRule="auto"/>
+      </w:pPr>
+    </w:p>
+    <w:p>
+      <w:pPr>
+        <w:spacing w:after="120" w:line="240" w:lineRule="auto"/>
+      </w:pPr>
+    </w:p>
+    <w:p>
+      <w:pPr>
+        <w:pStyle w:val="Heading1"/>
+      </w:pPr>
+      <w:r>
+        <w:t>IMPORTANT Notes</w:t>
+      </w:r>
+    </w:p>
+    <w:p>
       <w:pPr>
         <w:pStyle w:val="Heading2"/>
-        <w:numPr>
-          <w:ilvl w:val="0"/>
-          <w:numId w:val="13"/>
-        </w:numPr>
-        <w:rPr>
-          <w:color w:val="EE0000"/>
-          <w:sz w:val="32"/>
-          <w:szCs w:val="32"/>
-        </w:rPr>
-      </w:pPr>
-      <w:r>
-        <w:rPr>
-          <w:color w:val="EE0000"/>
-          <w:sz w:val="32"/>
-          <w:szCs w:val="32"/>
-        </w:rPr>
+      </w:pPr>
+      <w:r>
+        <w:t xml:space="preserve">1. </w:t>
+      </w:r>
+      <w:r>
         <w:t xml:space="preserve">Set Up </w:t>
       </w:r>
       <w:proofErr w:type="gramStart"/>
       <w:r>
-        <w:rPr>
-          <w:color w:val="EE0000"/>
-          <w:sz w:val="32"/>
-          <w:szCs w:val="32"/>
-        </w:rPr>
         <w:t>pyproject.toml</w:t>
       </w:r>
       <w:proofErr w:type="gramEnd"/>
       <w:r>
-        <w:rPr>
-          <w:color w:val="EE0000"/>
-          <w:sz w:val="32"/>
-          <w:szCs w:val="32"/>
-        </w:rPr>
-        <w:t xml:space="preserve"> – </w:t>
-      </w:r>
-      <w:r>
-        <w:rPr>
-          <w:b w:val="0"/>
-          <w:bCs w:val="0"/>
-          <w:color w:val="EE0000"/>
-          <w:sz w:val="28"/>
-          <w:szCs w:val="28"/>
-        </w:rPr>
-        <w:t>bold text is command</w:t>
+        <w:t xml:space="preserve"> – bold text is command</w:t>
       </w:r>
     </w:p>
     <w:p>
@@ -1428,6 +1578,491 @@
         </w:rPr>
         <w:t>poetry export -f requirements.txt --output requirements.txt</w:t>
       </w:r>
+    </w:p>
+    <w:p>
+      <w:pPr>
+        <w:pStyle w:val="Heading2"/>
+      </w:pPr>
+      <w:r>
+        <w:t xml:space="preserve">2. </w:t>
+      </w:r>
+      <w:r>
+        <w:t>About Dataset</w:t>
+      </w:r>
+    </w:p>
+    <w:p>
+      <w:pPr>
+        <w:pStyle w:val="ListParagraph"/>
+        <w:numPr>
+          <w:ilvl w:val="0"/>
+          <w:numId w:val="16"/>
+        </w:numPr>
+        <w:rPr>
+          <w:lang w:val="en-IN"/>
+        </w:rPr>
+      </w:pPr>
+      <w:r>
+        <w:rPr>
+          <w:lang w:val="en-IN"/>
+        </w:rPr>
+        <w:t xml:space="preserve">IEEE-CIS Fraud Detection: </w:t>
+      </w:r>
+      <w:hyperlink r:id="rId6" w:history="1">
+        <w:r>
+          <w:rPr>
+            <w:rStyle w:val="Hyperlink"/>
+            <w:b/>
+            <w:bCs/>
+          </w:rPr>
+          <w:t>Link | Kaggle</w:t>
+        </w:r>
+      </w:hyperlink>
+    </w:p>
+    <w:p>
+      <w:pPr>
+        <w:pStyle w:val="ListParagraph"/>
+        <w:numPr>
+          <w:ilvl w:val="0"/>
+          <w:numId w:val="16"/>
+        </w:numPr>
+        <w:rPr>
+          <w:b/>
+          <w:bCs/>
+          <w:lang w:val="en-IN"/>
+        </w:rPr>
+      </w:pPr>
+      <w:r>
+        <w:rPr>
+          <w:b/>
+          <w:bCs/>
+          <w:lang w:val="en-IN"/>
+        </w:rPr>
+        <w:t>Dataset Description</w:t>
+      </w:r>
+    </w:p>
+    <w:p>
+      <w:pPr>
+        <w:pStyle w:val="ListParagraph"/>
+        <w:numPr>
+          <w:ilvl w:val="1"/>
+          <w:numId w:val="16"/>
+        </w:numPr>
+        <w:rPr>
+          <w:lang w:val="en-IN"/>
+        </w:rPr>
+      </w:pPr>
+      <w:r>
+        <w:rPr>
+          <w:lang w:val="en-IN"/>
+        </w:rPr>
+        <w:t>In this competition you are predicting the probability that an online transaction is fraudulent, as denoted by the binary target </w:t>
+      </w:r>
+      <w:r>
+        <w:rPr>
+          <w:b/>
+          <w:bCs/>
+          <w:lang w:val="en-IN"/>
+        </w:rPr>
+        <w:t>isFraud</w:t>
+      </w:r>
+      <w:r>
+        <w:rPr>
+          <w:lang w:val="en-IN"/>
+        </w:rPr>
+        <w:t>.</w:t>
+      </w:r>
+    </w:p>
+    <w:p>
+      <w:pPr>
+        <w:pStyle w:val="ListParagraph"/>
+        <w:numPr>
+          <w:ilvl w:val="1"/>
+          <w:numId w:val="16"/>
+        </w:numPr>
+        <w:rPr>
+          <w:lang w:val="en-IN"/>
+        </w:rPr>
+      </w:pPr>
+      <w:r>
+        <w:rPr>
+          <w:lang w:val="en-IN"/>
+        </w:rPr>
+        <w:t>The data is broken into two files identity and transaction, which are joined by TransactionID. Not all transactions have corresponding identity information.</w:t>
+      </w:r>
+    </w:p>
+    <w:p>
+      <w:pPr>
+        <w:pStyle w:val="ListParagraph"/>
+        <w:numPr>
+          <w:ilvl w:val="1"/>
+          <w:numId w:val="16"/>
+        </w:numPr>
+        <w:rPr>
+          <w:b/>
+          <w:bCs/>
+          <w:lang w:val="en-IN"/>
+        </w:rPr>
+      </w:pPr>
+      <w:r>
+        <w:rPr>
+          <w:b/>
+          <w:bCs/>
+          <w:lang w:val="en-IN"/>
+        </w:rPr>
+        <w:t>Categorical Features - Transaction</w:t>
+      </w:r>
+    </w:p>
+    <w:p>
+      <w:pPr>
+        <w:pStyle w:val="ListParagraph"/>
+        <w:numPr>
+          <w:ilvl w:val="2"/>
+          <w:numId w:val="16"/>
+        </w:numPr>
+        <w:rPr>
+          <w:lang w:val="en-IN"/>
+        </w:rPr>
+      </w:pPr>
+      <w:r>
+        <w:rPr>
+          <w:lang w:val="en-IN"/>
+        </w:rPr>
+        <w:t>ProductCD</w:t>
+      </w:r>
+    </w:p>
+    <w:p>
+      <w:pPr>
+        <w:pStyle w:val="ListParagraph"/>
+        <w:numPr>
+          <w:ilvl w:val="2"/>
+          <w:numId w:val="16"/>
+        </w:numPr>
+        <w:rPr>
+          <w:lang w:val="en-IN"/>
+        </w:rPr>
+      </w:pPr>
+      <w:r>
+        <w:rPr>
+          <w:lang w:val="en-IN"/>
+        </w:rPr>
+        <w:t>card1 - card6</w:t>
+      </w:r>
+    </w:p>
+    <w:p>
+      <w:pPr>
+        <w:pStyle w:val="ListParagraph"/>
+        <w:numPr>
+          <w:ilvl w:val="2"/>
+          <w:numId w:val="16"/>
+        </w:numPr>
+        <w:rPr>
+          <w:lang w:val="en-IN"/>
+        </w:rPr>
+      </w:pPr>
+      <w:r>
+        <w:rPr>
+          <w:lang w:val="en-IN"/>
+        </w:rPr>
+        <w:t>addr1, addr2</w:t>
+      </w:r>
+    </w:p>
+    <w:p>
+      <w:pPr>
+        <w:pStyle w:val="ListParagraph"/>
+        <w:numPr>
+          <w:ilvl w:val="2"/>
+          <w:numId w:val="16"/>
+        </w:numPr>
+        <w:rPr>
+          <w:lang w:val="en-IN"/>
+        </w:rPr>
+      </w:pPr>
+      <w:r>
+        <w:rPr>
+          <w:lang w:val="en-IN"/>
+        </w:rPr>
+        <w:t>P_emaildomain</w:t>
+      </w:r>
+    </w:p>
+    <w:p>
+      <w:pPr>
+        <w:pStyle w:val="ListParagraph"/>
+        <w:numPr>
+          <w:ilvl w:val="2"/>
+          <w:numId w:val="16"/>
+        </w:numPr>
+        <w:rPr>
+          <w:lang w:val="en-IN"/>
+        </w:rPr>
+      </w:pPr>
+      <w:r>
+        <w:rPr>
+          <w:lang w:val="en-IN"/>
+        </w:rPr>
+        <w:t>R_emaildomain</w:t>
+      </w:r>
+    </w:p>
+    <w:p>
+      <w:pPr>
+        <w:pStyle w:val="ListParagraph"/>
+        <w:numPr>
+          <w:ilvl w:val="2"/>
+          <w:numId w:val="16"/>
+        </w:numPr>
+        <w:rPr>
+          <w:lang w:val="en-IN"/>
+        </w:rPr>
+      </w:pPr>
+      <w:r>
+        <w:rPr>
+          <w:lang w:val="en-IN"/>
+        </w:rPr>
+        <w:t>M1 - M9</w:t>
+      </w:r>
+    </w:p>
+    <w:p>
+      <w:pPr>
+        <w:pStyle w:val="ListParagraph"/>
+        <w:numPr>
+          <w:ilvl w:val="1"/>
+          <w:numId w:val="16"/>
+        </w:numPr>
+        <w:rPr>
+          <w:b/>
+          <w:bCs/>
+          <w:lang w:val="en-IN"/>
+        </w:rPr>
+      </w:pPr>
+      <w:r>
+        <w:rPr>
+          <w:b/>
+          <w:bCs/>
+          <w:lang w:val="en-IN"/>
+        </w:rPr>
+        <w:t>Categorical Features - Identity</w:t>
+      </w:r>
+    </w:p>
+    <w:p>
+      <w:pPr>
+        <w:pStyle w:val="ListParagraph"/>
+        <w:numPr>
+          <w:ilvl w:val="2"/>
+          <w:numId w:val="16"/>
+        </w:numPr>
+        <w:rPr>
+          <w:lang w:val="en-IN"/>
+        </w:rPr>
+      </w:pPr>
+      <w:r>
+        <w:rPr>
+          <w:lang w:val="en-IN"/>
+        </w:rPr>
+        <w:t>DeviceType</w:t>
+      </w:r>
+    </w:p>
+    <w:p>
+      <w:pPr>
+        <w:pStyle w:val="ListParagraph"/>
+        <w:numPr>
+          <w:ilvl w:val="2"/>
+          <w:numId w:val="16"/>
+        </w:numPr>
+        <w:rPr>
+          <w:lang w:val="en-IN"/>
+        </w:rPr>
+      </w:pPr>
+      <w:r>
+        <w:rPr>
+          <w:lang w:val="en-IN"/>
+        </w:rPr>
+        <w:t>DeviceInfo</w:t>
+      </w:r>
+    </w:p>
+    <w:p>
+      <w:pPr>
+        <w:pStyle w:val="ListParagraph"/>
+        <w:numPr>
+          <w:ilvl w:val="2"/>
+          <w:numId w:val="16"/>
+        </w:numPr>
+        <w:rPr>
+          <w:lang w:val="en-IN"/>
+        </w:rPr>
+      </w:pPr>
+      <w:r>
+        <w:rPr>
+          <w:lang w:val="en-IN"/>
+        </w:rPr>
+        <w:t>id_12 - id_38</w:t>
+      </w:r>
+    </w:p>
+    <w:p>
+      <w:pPr>
+        <w:pStyle w:val="ListParagraph"/>
+        <w:numPr>
+          <w:ilvl w:val="2"/>
+          <w:numId w:val="16"/>
+        </w:numPr>
+        <w:rPr>
+          <w:lang w:val="en-IN"/>
+        </w:rPr>
+      </w:pPr>
+      <w:r>
+        <w:rPr>
+          <w:lang w:val="en-IN"/>
+        </w:rPr>
+        <w:t>The TransactionDT feature is a timedelta from a given reference datetime (not an actual timestamp).</w:t>
+      </w:r>
+    </w:p>
+    <w:p>
+      <w:pPr>
+        <w:pStyle w:val="ListParagraph"/>
+        <w:numPr>
+          <w:ilvl w:val="2"/>
+          <w:numId w:val="16"/>
+        </w:numPr>
+        <w:rPr>
+          <w:lang w:val="en-IN"/>
+        </w:rPr>
+      </w:pPr>
+      <w:r>
+        <w:rPr>
+          <w:lang w:val="en-IN"/>
+        </w:rPr>
+        <w:t>You can read more about the data from </w:t>
+      </w:r>
+      <w:hyperlink r:id="rId7" w:tgtFrame="_blank" w:history="1">
+        <w:r>
+          <w:rPr>
+            <w:rStyle w:val="Hyperlink"/>
+            <w:lang w:val="en-IN"/>
+          </w:rPr>
+          <w:t>this post by the competition host</w:t>
+        </w:r>
+      </w:hyperlink>
+      <w:r>
+        <w:rPr>
+          <w:lang w:val="en-IN"/>
+        </w:rPr>
+        <w:t>.</w:t>
+      </w:r>
+    </w:p>
+    <w:p>
+      <w:pPr>
+        <w:pStyle w:val="ListParagraph"/>
+        <w:numPr>
+          <w:ilvl w:val="1"/>
+          <w:numId w:val="16"/>
+        </w:numPr>
+        <w:rPr>
+          <w:b/>
+          <w:bCs/>
+          <w:lang w:val="en-IN"/>
+        </w:rPr>
+      </w:pPr>
+      <w:r>
+        <w:rPr>
+          <w:b/>
+          <w:bCs/>
+          <w:lang w:val="en-IN"/>
+        </w:rPr>
+        <w:t>Files</w:t>
+      </w:r>
+    </w:p>
+    <w:p>
+      <w:pPr>
+        <w:pStyle w:val="ListParagraph"/>
+        <w:numPr>
+          <w:ilvl w:val="2"/>
+          <w:numId w:val="20"/>
+        </w:numPr>
+        <w:rPr>
+          <w:lang w:val="en-IN"/>
+        </w:rPr>
+      </w:pPr>
+      <w:r>
+        <w:rPr>
+          <w:b/>
+          <w:bCs/>
+          <w:lang w:val="en-IN"/>
+        </w:rPr>
+        <w:t>train_{transaction, identity}.csv</w:t>
+      </w:r>
+      <w:r>
+        <w:rPr>
+          <w:lang w:val="en-IN"/>
+        </w:rPr>
+        <w:t> - the training set</w:t>
+      </w:r>
+    </w:p>
+    <w:p>
+      <w:pPr>
+        <w:pStyle w:val="ListParagraph"/>
+        <w:numPr>
+          <w:ilvl w:val="2"/>
+          <w:numId w:val="20"/>
+        </w:numPr>
+        <w:rPr>
+          <w:lang w:val="en-IN"/>
+        </w:rPr>
+      </w:pPr>
+      <w:r>
+        <w:rPr>
+          <w:b/>
+          <w:bCs/>
+          <w:lang w:val="en-IN"/>
+        </w:rPr>
+        <w:t>test_{transaction, identity}.csv</w:t>
+      </w:r>
+      <w:r>
+        <w:rPr>
+          <w:lang w:val="en-IN"/>
+        </w:rPr>
+        <w:t> - the test set (you must predict the isFraud value for these observations)</w:t>
+      </w:r>
+    </w:p>
+    <w:p>
+      <w:pPr>
+        <w:pStyle w:val="ListParagraph"/>
+        <w:numPr>
+          <w:ilvl w:val="2"/>
+          <w:numId w:val="20"/>
+        </w:numPr>
+        <w:rPr>
+          <w:lang w:val="en-IN"/>
+        </w:rPr>
+      </w:pPr>
+      <w:r>
+        <w:rPr>
+          <w:b/>
+          <w:bCs/>
+          <w:lang w:val="en-IN"/>
+        </w:rPr>
+        <w:t>sample_submission.csv</w:t>
+      </w:r>
+      <w:r>
+        <w:rPr>
+          <w:lang w:val="en-IN"/>
+        </w:rPr>
+        <w:t> - a sample submission file in the correct format</w:t>
+      </w:r>
+    </w:p>
+    <w:p>
+      <w:pPr>
+        <w:rPr>
+          <w:lang w:val="en-IN"/>
+        </w:rPr>
+      </w:pPr>
+    </w:p>
+    <w:p/>
+    <w:p>
+      <w:pPr>
+        <w:ind w:left="720"/>
+        <w:rPr>
+          <w:b/>
+          <w:bCs/>
+        </w:rPr>
+      </w:pPr>
     </w:p>
     <w:p>
       <w:pPr>
@@ -1808,8 +2443,8 @@
   <w:abstractNum w:abstractNumId="11" w15:restartNumberingAfterBreak="0">
     <w:nsid w:val="0DDA278F"/>
     <w:multiLevelType w:val="hybridMultilevel"/>
-    <w:tmpl w:val="D78E0F0E"/>
-    <w:lvl w:ilvl="0" w:tplc="4009000F">
+    <w:tmpl w:val="CDDE4824"/>
+    <w:lvl w:ilvl="0" w:tplc="029C7F88">
       <w:start w:val="1"/>
       <w:numFmt w:val="decimal"/>
       <w:lvlText w:val="%1."/>
@@ -1895,6 +2530,155 @@
     </w:lvl>
   </w:abstractNum>
   <w:abstractNum w:abstractNumId="12" w15:restartNumberingAfterBreak="0">
+    <w:nsid w:val="115C3604"/>
+    <w:multiLevelType w:val="multilevel"/>
+    <w:tmpl w:val="F36285F6"/>
+    <w:lvl w:ilvl="0">
+      <w:start w:val="1"/>
+      <w:numFmt w:val="bullet"/>
+      <w:lvlText w:val=""/>
+      <w:lvlJc w:val="left"/>
+      <w:pPr>
+        <w:tabs>
+          <w:tab w:val="num" w:pos="720"/>
+        </w:tabs>
+        <w:ind w:left="720" w:hanging="360"/>
+      </w:pPr>
+      <w:rPr>
+        <w:rFonts w:ascii="Symbol" w:hAnsi="Symbol" w:hint="default"/>
+        <w:sz w:val="20"/>
+      </w:rPr>
+    </w:lvl>
+    <w:lvl w:ilvl="1" w:tentative="1">
+      <w:start w:val="1"/>
+      <w:numFmt w:val="bullet"/>
+      <w:lvlText w:val=""/>
+      <w:lvlJc w:val="left"/>
+      <w:pPr>
+        <w:tabs>
+          <w:tab w:val="num" w:pos="1440"/>
+        </w:tabs>
+        <w:ind w:left="1440" w:hanging="360"/>
+      </w:pPr>
+      <w:rPr>
+        <w:rFonts w:ascii="Symbol" w:hAnsi="Symbol" w:hint="default"/>
+        <w:sz w:val="20"/>
+      </w:rPr>
+    </w:lvl>
+    <w:lvl w:ilvl="2" w:tentative="1">
+      <w:start w:val="1"/>
+      <w:numFmt w:val="bullet"/>
+      <w:lvlText w:val=""/>
+      <w:lvlJc w:val="left"/>
+      <w:pPr>
+        <w:tabs>
+          <w:tab w:val="num" w:pos="2160"/>
+        </w:tabs>
+        <w:ind w:left="2160" w:hanging="360"/>
+      </w:pPr>
+      <w:rPr>
+        <w:rFonts w:ascii="Symbol" w:hAnsi="Symbol" w:hint="default"/>
+        <w:sz w:val="20"/>
+      </w:rPr>
+    </w:lvl>
+    <w:lvl w:ilvl="3" w:tentative="1">
+      <w:start w:val="1"/>
+      <w:numFmt w:val="bullet"/>
+      <w:lvlText w:val=""/>
+      <w:lvlJc w:val="left"/>
+      <w:pPr>
+        <w:tabs>
+          <w:tab w:val="num" w:pos="2880"/>
+        </w:tabs>
+        <w:ind w:left="2880" w:hanging="360"/>
+      </w:pPr>
+      <w:rPr>
+        <w:rFonts w:ascii="Symbol" w:hAnsi="Symbol" w:hint="default"/>
+        <w:sz w:val="20"/>
+      </w:rPr>
+    </w:lvl>
+    <w:lvl w:ilvl="4" w:tentative="1">
+      <w:start w:val="1"/>
+      <w:numFmt w:val="bullet"/>
+      <w:lvlText w:val=""/>
+      <w:lvlJc w:val="left"/>
+      <w:pPr>
+        <w:tabs>
+          <w:tab w:val="num" w:pos="3600"/>
+        </w:tabs>
+        <w:ind w:left="3600" w:hanging="360"/>
+      </w:pPr>
+      <w:rPr>
+        <w:rFonts w:ascii="Symbol" w:hAnsi="Symbol" w:hint="default"/>
+        <w:sz w:val="20"/>
+      </w:rPr>
+    </w:lvl>
+    <w:lvl w:ilvl="5" w:tentative="1">
+      <w:start w:val="1"/>
+      <w:numFmt w:val="bullet"/>
+      <w:lvlText w:val=""/>
+      <w:lvlJc w:val="left"/>
+      <w:pPr>
+        <w:tabs>
+          <w:tab w:val="num" w:pos="4320"/>
+        </w:tabs>
+        <w:ind w:left="4320" w:hanging="360"/>
+      </w:pPr>
+      <w:rPr>
+        <w:rFonts w:ascii="Symbol" w:hAnsi="Symbol" w:hint="default"/>
+        <w:sz w:val="20"/>
+      </w:rPr>
+    </w:lvl>
+    <w:lvl w:ilvl="6" w:tentative="1">
+      <w:start w:val="1"/>
+      <w:numFmt w:val="bullet"/>
+      <w:lvlText w:val=""/>
+      <w:lvlJc w:val="left"/>
+      <w:pPr>
+        <w:tabs>
+          <w:tab w:val="num" w:pos="5040"/>
+        </w:tabs>
+        <w:ind w:left="5040" w:hanging="360"/>
+      </w:pPr>
+      <w:rPr>
+        <w:rFonts w:ascii="Symbol" w:hAnsi="Symbol" w:hint="default"/>
+        <w:sz w:val="20"/>
+      </w:rPr>
+    </w:lvl>
+    <w:lvl w:ilvl="7" w:tentative="1">
+      <w:start w:val="1"/>
+      <w:numFmt w:val="bullet"/>
+      <w:lvlText w:val=""/>
+      <w:lvlJc w:val="left"/>
+      <w:pPr>
+        <w:tabs>
+          <w:tab w:val="num" w:pos="5760"/>
+        </w:tabs>
+        <w:ind w:left="5760" w:hanging="360"/>
+      </w:pPr>
+      <w:rPr>
+        <w:rFonts w:ascii="Symbol" w:hAnsi="Symbol" w:hint="default"/>
+        <w:sz w:val="20"/>
+      </w:rPr>
+    </w:lvl>
+    <w:lvl w:ilvl="8" w:tentative="1">
+      <w:start w:val="1"/>
+      <w:numFmt w:val="bullet"/>
+      <w:lvlText w:val=""/>
+      <w:lvlJc w:val="left"/>
+      <w:pPr>
+        <w:tabs>
+          <w:tab w:val="num" w:pos="6480"/>
+        </w:tabs>
+        <w:ind w:left="6480" w:hanging="360"/>
+      </w:pPr>
+      <w:rPr>
+        <w:rFonts w:ascii="Symbol" w:hAnsi="Symbol" w:hint="default"/>
+        <w:sz w:val="20"/>
+      </w:rPr>
+    </w:lvl>
+  </w:abstractNum>
+  <w:abstractNum w:abstractNumId="13" w15:restartNumberingAfterBreak="0">
     <w:nsid w:val="165E40B1"/>
     <w:multiLevelType w:val="hybridMultilevel"/>
     <w:tmpl w:val="AB64CCC0"/>
@@ -1983,7 +2767,480 @@
       </w:pPr>
     </w:lvl>
   </w:abstractNum>
-  <w:abstractNum w:abstractNumId="13" w15:restartNumberingAfterBreak="0">
+  <w:abstractNum w:abstractNumId="14" w15:restartNumberingAfterBreak="0">
+    <w:nsid w:val="346970EB"/>
+    <w:multiLevelType w:val="hybridMultilevel"/>
+    <w:tmpl w:val="C3B0AE42"/>
+    <w:lvl w:ilvl="0" w:tplc="4009000F">
+      <w:start w:val="1"/>
+      <w:numFmt w:val="decimal"/>
+      <w:lvlText w:val="%1."/>
+      <w:lvlJc w:val="left"/>
+      <w:pPr>
+        <w:ind w:left="720" w:hanging="360"/>
+      </w:pPr>
+      <w:rPr>
+        <w:rFonts w:hint="default"/>
+      </w:rPr>
+    </w:lvl>
+    <w:lvl w:ilvl="1" w:tplc="40090019">
+      <w:start w:val="1"/>
+      <w:numFmt w:val="lowerLetter"/>
+      <w:lvlText w:val="%2."/>
+      <w:lvlJc w:val="left"/>
+      <w:pPr>
+        <w:ind w:left="1440" w:hanging="360"/>
+      </w:pPr>
+    </w:lvl>
+    <w:lvl w:ilvl="2" w:tplc="4009001B">
+      <w:start w:val="1"/>
+      <w:numFmt w:val="lowerRoman"/>
+      <w:lvlText w:val="%3."/>
+      <w:lvlJc w:val="right"/>
+      <w:pPr>
+        <w:ind w:left="2160" w:hanging="180"/>
+      </w:pPr>
+    </w:lvl>
+    <w:lvl w:ilvl="3" w:tplc="4009000F" w:tentative="1">
+      <w:start w:val="1"/>
+      <w:numFmt w:val="decimal"/>
+      <w:lvlText w:val="%4."/>
+      <w:lvlJc w:val="left"/>
+      <w:pPr>
+        <w:ind w:left="2880" w:hanging="360"/>
+      </w:pPr>
+    </w:lvl>
+    <w:lvl w:ilvl="4" w:tplc="40090019" w:tentative="1">
+      <w:start w:val="1"/>
+      <w:numFmt w:val="lowerLetter"/>
+      <w:lvlText w:val="%5."/>
+      <w:lvlJc w:val="left"/>
+      <w:pPr>
+        <w:ind w:left="3600" w:hanging="360"/>
+      </w:pPr>
+    </w:lvl>
+    <w:lvl w:ilvl="5" w:tplc="4009001B" w:tentative="1">
+      <w:start w:val="1"/>
+      <w:numFmt w:val="lowerRoman"/>
+      <w:lvlText w:val="%6."/>
+      <w:lvlJc w:val="right"/>
+      <w:pPr>
+        <w:ind w:left="4320" w:hanging="180"/>
+      </w:pPr>
+    </w:lvl>
+    <w:lvl w:ilvl="6" w:tplc="4009000F" w:tentative="1">
+      <w:start w:val="1"/>
+      <w:numFmt w:val="decimal"/>
+      <w:lvlText w:val="%7."/>
+      <w:lvlJc w:val="left"/>
+      <w:pPr>
+        <w:ind w:left="5040" w:hanging="360"/>
+      </w:pPr>
+    </w:lvl>
+    <w:lvl w:ilvl="7" w:tplc="40090019" w:tentative="1">
+      <w:start w:val="1"/>
+      <w:numFmt w:val="lowerLetter"/>
+      <w:lvlText w:val="%8."/>
+      <w:lvlJc w:val="left"/>
+      <w:pPr>
+        <w:ind w:left="5760" w:hanging="360"/>
+      </w:pPr>
+    </w:lvl>
+    <w:lvl w:ilvl="8" w:tplc="4009001B" w:tentative="1">
+      <w:start w:val="1"/>
+      <w:numFmt w:val="lowerRoman"/>
+      <w:lvlText w:val="%9."/>
+      <w:lvlJc w:val="right"/>
+      <w:pPr>
+        <w:ind w:left="6480" w:hanging="180"/>
+      </w:pPr>
+    </w:lvl>
+  </w:abstractNum>
+  <w:abstractNum w:abstractNumId="15" w15:restartNumberingAfterBreak="0">
+    <w:nsid w:val="422413C6"/>
+    <w:multiLevelType w:val="hybridMultilevel"/>
+    <w:tmpl w:val="91ECB31C"/>
+    <w:lvl w:ilvl="0" w:tplc="4009000F">
+      <w:start w:val="1"/>
+      <w:numFmt w:val="decimal"/>
+      <w:lvlText w:val="%1."/>
+      <w:lvlJc w:val="left"/>
+      <w:pPr>
+        <w:ind w:left="720" w:hanging="360"/>
+      </w:pPr>
+    </w:lvl>
+    <w:lvl w:ilvl="1" w:tplc="40090019" w:tentative="1">
+      <w:start w:val="1"/>
+      <w:numFmt w:val="lowerLetter"/>
+      <w:lvlText w:val="%2."/>
+      <w:lvlJc w:val="left"/>
+      <w:pPr>
+        <w:ind w:left="1440" w:hanging="360"/>
+      </w:pPr>
+    </w:lvl>
+    <w:lvl w:ilvl="2" w:tplc="4009001B" w:tentative="1">
+      <w:start w:val="1"/>
+      <w:numFmt w:val="lowerRoman"/>
+      <w:lvlText w:val="%3."/>
+      <w:lvlJc w:val="right"/>
+      <w:pPr>
+        <w:ind w:left="2160" w:hanging="180"/>
+      </w:pPr>
+    </w:lvl>
+    <w:lvl w:ilvl="3" w:tplc="4009000F" w:tentative="1">
+      <w:start w:val="1"/>
+      <w:numFmt w:val="decimal"/>
+      <w:lvlText w:val="%4."/>
+      <w:lvlJc w:val="left"/>
+      <w:pPr>
+        <w:ind w:left="2880" w:hanging="360"/>
+      </w:pPr>
+    </w:lvl>
+    <w:lvl w:ilvl="4" w:tplc="40090019" w:tentative="1">
+      <w:start w:val="1"/>
+      <w:numFmt w:val="lowerLetter"/>
+      <w:lvlText w:val="%5."/>
+      <w:lvlJc w:val="left"/>
+      <w:pPr>
+        <w:ind w:left="3600" w:hanging="360"/>
+      </w:pPr>
+    </w:lvl>
+    <w:lvl w:ilvl="5" w:tplc="4009001B" w:tentative="1">
+      <w:start w:val="1"/>
+      <w:numFmt w:val="lowerRoman"/>
+      <w:lvlText w:val="%6."/>
+      <w:lvlJc w:val="right"/>
+      <w:pPr>
+        <w:ind w:left="4320" w:hanging="180"/>
+      </w:pPr>
+    </w:lvl>
+    <w:lvl w:ilvl="6" w:tplc="4009000F" w:tentative="1">
+      <w:start w:val="1"/>
+      <w:numFmt w:val="decimal"/>
+      <w:lvlText w:val="%7."/>
+      <w:lvlJc w:val="left"/>
+      <w:pPr>
+        <w:ind w:left="5040" w:hanging="360"/>
+      </w:pPr>
+    </w:lvl>
+    <w:lvl w:ilvl="7" w:tplc="40090019" w:tentative="1">
+      <w:start w:val="1"/>
+      <w:numFmt w:val="lowerLetter"/>
+      <w:lvlText w:val="%8."/>
+      <w:lvlJc w:val="left"/>
+      <w:pPr>
+        <w:ind w:left="5760" w:hanging="360"/>
+      </w:pPr>
+    </w:lvl>
+    <w:lvl w:ilvl="8" w:tplc="4009001B" w:tentative="1">
+      <w:start w:val="1"/>
+      <w:numFmt w:val="lowerRoman"/>
+      <w:lvlText w:val="%9."/>
+      <w:lvlJc w:val="right"/>
+      <w:pPr>
+        <w:ind w:left="6480" w:hanging="180"/>
+      </w:pPr>
+    </w:lvl>
+  </w:abstractNum>
+  <w:abstractNum w:abstractNumId="16" w15:restartNumberingAfterBreak="0">
+    <w:nsid w:val="556F5316"/>
+    <w:multiLevelType w:val="multilevel"/>
+    <w:tmpl w:val="71180B5E"/>
+    <w:lvl w:ilvl="0">
+      <w:start w:val="1"/>
+      <w:numFmt w:val="bullet"/>
+      <w:lvlText w:val=""/>
+      <w:lvlJc w:val="left"/>
+      <w:pPr>
+        <w:tabs>
+          <w:tab w:val="num" w:pos="720"/>
+        </w:tabs>
+        <w:ind w:left="720" w:hanging="360"/>
+      </w:pPr>
+      <w:rPr>
+        <w:rFonts w:ascii="Symbol" w:hAnsi="Symbol" w:hint="default"/>
+        <w:sz w:val="20"/>
+      </w:rPr>
+    </w:lvl>
+    <w:lvl w:ilvl="1" w:tentative="1">
+      <w:start w:val="1"/>
+      <w:numFmt w:val="bullet"/>
+      <w:lvlText w:val=""/>
+      <w:lvlJc w:val="left"/>
+      <w:pPr>
+        <w:tabs>
+          <w:tab w:val="num" w:pos="1440"/>
+        </w:tabs>
+        <w:ind w:left="1440" w:hanging="360"/>
+      </w:pPr>
+      <w:rPr>
+        <w:rFonts w:ascii="Symbol" w:hAnsi="Symbol" w:hint="default"/>
+        <w:sz w:val="20"/>
+      </w:rPr>
+    </w:lvl>
+    <w:lvl w:ilvl="2" w:tentative="1">
+      <w:start w:val="1"/>
+      <w:numFmt w:val="bullet"/>
+      <w:lvlText w:val=""/>
+      <w:lvlJc w:val="left"/>
+      <w:pPr>
+        <w:tabs>
+          <w:tab w:val="num" w:pos="2160"/>
+        </w:tabs>
+        <w:ind w:left="2160" w:hanging="360"/>
+      </w:pPr>
+      <w:rPr>
+        <w:rFonts w:ascii="Symbol" w:hAnsi="Symbol" w:hint="default"/>
+        <w:sz w:val="20"/>
+      </w:rPr>
+    </w:lvl>
+    <w:lvl w:ilvl="3" w:tentative="1">
+      <w:start w:val="1"/>
+      <w:numFmt w:val="bullet"/>
+      <w:lvlText w:val=""/>
+      <w:lvlJc w:val="left"/>
+      <w:pPr>
+        <w:tabs>
+          <w:tab w:val="num" w:pos="2880"/>
+        </w:tabs>
+        <w:ind w:left="2880" w:hanging="360"/>
+      </w:pPr>
+      <w:rPr>
+        <w:rFonts w:ascii="Symbol" w:hAnsi="Symbol" w:hint="default"/>
+        <w:sz w:val="20"/>
+      </w:rPr>
+    </w:lvl>
+    <w:lvl w:ilvl="4" w:tentative="1">
+      <w:start w:val="1"/>
+      <w:numFmt w:val="bullet"/>
+      <w:lvlText w:val=""/>
+      <w:lvlJc w:val="left"/>
+      <w:pPr>
+        <w:tabs>
+          <w:tab w:val="num" w:pos="3600"/>
+        </w:tabs>
+        <w:ind w:left="3600" w:hanging="360"/>
+      </w:pPr>
+      <w:rPr>
+        <w:rFonts w:ascii="Symbol" w:hAnsi="Symbol" w:hint="default"/>
+        <w:sz w:val="20"/>
+      </w:rPr>
+    </w:lvl>
+    <w:lvl w:ilvl="5" w:tentative="1">
+      <w:start w:val="1"/>
+      <w:numFmt w:val="bullet"/>
+      <w:lvlText w:val=""/>
+      <w:lvlJc w:val="left"/>
+      <w:pPr>
+        <w:tabs>
+          <w:tab w:val="num" w:pos="4320"/>
+        </w:tabs>
+        <w:ind w:left="4320" w:hanging="360"/>
+      </w:pPr>
+      <w:rPr>
+        <w:rFonts w:ascii="Symbol" w:hAnsi="Symbol" w:hint="default"/>
+        <w:sz w:val="20"/>
+      </w:rPr>
+    </w:lvl>
+    <w:lvl w:ilvl="6" w:tentative="1">
+      <w:start w:val="1"/>
+      <w:numFmt w:val="bullet"/>
+      <w:lvlText w:val=""/>
+      <w:lvlJc w:val="left"/>
+      <w:pPr>
+        <w:tabs>
+          <w:tab w:val="num" w:pos="5040"/>
+        </w:tabs>
+        <w:ind w:left="5040" w:hanging="360"/>
+      </w:pPr>
+      <w:rPr>
+        <w:rFonts w:ascii="Symbol" w:hAnsi="Symbol" w:hint="default"/>
+        <w:sz w:val="20"/>
+      </w:rPr>
+    </w:lvl>
+    <w:lvl w:ilvl="7" w:tentative="1">
+      <w:start w:val="1"/>
+      <w:numFmt w:val="bullet"/>
+      <w:lvlText w:val=""/>
+      <w:lvlJc w:val="left"/>
+      <w:pPr>
+        <w:tabs>
+          <w:tab w:val="num" w:pos="5760"/>
+        </w:tabs>
+        <w:ind w:left="5760" w:hanging="360"/>
+      </w:pPr>
+      <w:rPr>
+        <w:rFonts w:ascii="Symbol" w:hAnsi="Symbol" w:hint="default"/>
+        <w:sz w:val="20"/>
+      </w:rPr>
+    </w:lvl>
+    <w:lvl w:ilvl="8" w:tentative="1">
+      <w:start w:val="1"/>
+      <w:numFmt w:val="bullet"/>
+      <w:lvlText w:val=""/>
+      <w:lvlJc w:val="left"/>
+      <w:pPr>
+        <w:tabs>
+          <w:tab w:val="num" w:pos="6480"/>
+        </w:tabs>
+        <w:ind w:left="6480" w:hanging="360"/>
+      </w:pPr>
+      <w:rPr>
+        <w:rFonts w:ascii="Symbol" w:hAnsi="Symbol" w:hint="default"/>
+        <w:sz w:val="20"/>
+      </w:rPr>
+    </w:lvl>
+  </w:abstractNum>
+  <w:abstractNum w:abstractNumId="17" w15:restartNumberingAfterBreak="0">
+    <w:nsid w:val="5C7E265B"/>
+    <w:multiLevelType w:val="multilevel"/>
+    <w:tmpl w:val="6504BAA0"/>
+    <w:lvl w:ilvl="0">
+      <w:start w:val="1"/>
+      <w:numFmt w:val="bullet"/>
+      <w:lvlText w:val=""/>
+      <w:lvlJc w:val="left"/>
+      <w:pPr>
+        <w:tabs>
+          <w:tab w:val="num" w:pos="720"/>
+        </w:tabs>
+        <w:ind w:left="720" w:hanging="360"/>
+      </w:pPr>
+      <w:rPr>
+        <w:rFonts w:ascii="Symbol" w:hAnsi="Symbol" w:hint="default"/>
+        <w:sz w:val="20"/>
+      </w:rPr>
+    </w:lvl>
+    <w:lvl w:ilvl="1" w:tentative="1">
+      <w:start w:val="1"/>
+      <w:numFmt w:val="bullet"/>
+      <w:lvlText w:val=""/>
+      <w:lvlJc w:val="left"/>
+      <w:pPr>
+        <w:tabs>
+          <w:tab w:val="num" w:pos="1440"/>
+        </w:tabs>
+        <w:ind w:left="1440" w:hanging="360"/>
+      </w:pPr>
+      <w:rPr>
+        <w:rFonts w:ascii="Symbol" w:hAnsi="Symbol" w:hint="default"/>
+        <w:sz w:val="20"/>
+      </w:rPr>
+    </w:lvl>
+    <w:lvl w:ilvl="2" w:tentative="1">
+      <w:start w:val="1"/>
+      <w:numFmt w:val="bullet"/>
+      <w:lvlText w:val=""/>
+      <w:lvlJc w:val="left"/>
+      <w:pPr>
+        <w:tabs>
+          <w:tab w:val="num" w:pos="2160"/>
+        </w:tabs>
+        <w:ind w:left="2160" w:hanging="360"/>
+      </w:pPr>
+      <w:rPr>
+        <w:rFonts w:ascii="Symbol" w:hAnsi="Symbol" w:hint="default"/>
+        <w:sz w:val="20"/>
+      </w:rPr>
+    </w:lvl>
+    <w:lvl w:ilvl="3" w:tentative="1">
+      <w:start w:val="1"/>
+      <w:numFmt w:val="bullet"/>
+      <w:lvlText w:val=""/>
+      <w:lvlJc w:val="left"/>
+      <w:pPr>
+        <w:tabs>
+          <w:tab w:val="num" w:pos="2880"/>
+        </w:tabs>
+        <w:ind w:left="2880" w:hanging="360"/>
+      </w:pPr>
+      <w:rPr>
+        <w:rFonts w:ascii="Symbol" w:hAnsi="Symbol" w:hint="default"/>
+        <w:sz w:val="20"/>
+      </w:rPr>
+    </w:lvl>
+    <w:lvl w:ilvl="4" w:tentative="1">
+      <w:start w:val="1"/>
+      <w:numFmt w:val="bullet"/>
+      <w:lvlText w:val=""/>
+      <w:lvlJc w:val="left"/>
+      <w:pPr>
+        <w:tabs>
+          <w:tab w:val="num" w:pos="3600"/>
+        </w:tabs>
+        <w:ind w:left="3600" w:hanging="360"/>
+      </w:pPr>
+      <w:rPr>
+        <w:rFonts w:ascii="Symbol" w:hAnsi="Symbol" w:hint="default"/>
+        <w:sz w:val="20"/>
+      </w:rPr>
+    </w:lvl>
+    <w:lvl w:ilvl="5" w:tentative="1">
+      <w:start w:val="1"/>
+      <w:numFmt w:val="bullet"/>
+      <w:lvlText w:val=""/>
+      <w:lvlJc w:val="left"/>
+      <w:pPr>
+        <w:tabs>
+          <w:tab w:val="num" w:pos="4320"/>
+        </w:tabs>
+        <w:ind w:left="4320" w:hanging="360"/>
+      </w:pPr>
+      <w:rPr>
+        <w:rFonts w:ascii="Symbol" w:hAnsi="Symbol" w:hint="default"/>
+        <w:sz w:val="20"/>
+      </w:rPr>
+    </w:lvl>
+    <w:lvl w:ilvl="6" w:tentative="1">
+      <w:start w:val="1"/>
+      <w:numFmt w:val="bullet"/>
+      <w:lvlText w:val=""/>
+      <w:lvlJc w:val="left"/>
+      <w:pPr>
+        <w:tabs>
+          <w:tab w:val="num" w:pos="5040"/>
+        </w:tabs>
+        <w:ind w:left="5040" w:hanging="360"/>
+      </w:pPr>
+      <w:rPr>
+        <w:rFonts w:ascii="Symbol" w:hAnsi="Symbol" w:hint="default"/>
+        <w:sz w:val="20"/>
+      </w:rPr>
+    </w:lvl>
+    <w:lvl w:ilvl="7" w:tentative="1">
+      <w:start w:val="1"/>
+      <w:numFmt w:val="bullet"/>
+      <w:lvlText w:val=""/>
+      <w:lvlJc w:val="left"/>
+      <w:pPr>
+        <w:tabs>
+          <w:tab w:val="num" w:pos="5760"/>
+        </w:tabs>
+        <w:ind w:left="5760" w:hanging="360"/>
+      </w:pPr>
+      <w:rPr>
+        <w:rFonts w:ascii="Symbol" w:hAnsi="Symbol" w:hint="default"/>
+        <w:sz w:val="20"/>
+      </w:rPr>
+    </w:lvl>
+    <w:lvl w:ilvl="8" w:tentative="1">
+      <w:start w:val="1"/>
+      <w:numFmt w:val="bullet"/>
+      <w:lvlText w:val=""/>
+      <w:lvlJc w:val="left"/>
+      <w:pPr>
+        <w:tabs>
+          <w:tab w:val="num" w:pos="6480"/>
+        </w:tabs>
+        <w:ind w:left="6480" w:hanging="360"/>
+      </w:pPr>
+      <w:rPr>
+        <w:rFonts w:ascii="Symbol" w:hAnsi="Symbol" w:hint="default"/>
+        <w:sz w:val="20"/>
+      </w:rPr>
+    </w:lvl>
+  </w:abstractNum>
+  <w:abstractNum w:abstractNumId="18" w15:restartNumberingAfterBreak="0">
     <w:nsid w:val="779B51C7"/>
     <w:multiLevelType w:val="hybridMultilevel"/>
     <w:tmpl w:val="9FDEB194"/>
@@ -1993,19 +3250,19 @@
       <w:lvlText w:val="%1."/>
       <w:lvlJc w:val="left"/>
       <w:pPr>
-        <w:ind w:left="1080" w:hanging="360"/>
+        <w:ind w:left="720" w:hanging="360"/>
       </w:pPr>
       <w:rPr>
         <w:rFonts w:hint="default"/>
       </w:rPr>
     </w:lvl>
-    <w:lvl w:ilvl="1" w:tplc="40090019" w:tentative="1">
+    <w:lvl w:ilvl="1" w:tplc="40090019">
       <w:start w:val="1"/>
       <w:numFmt w:val="lowerLetter"/>
       <w:lvlText w:val="%2."/>
       <w:lvlJc w:val="left"/>
       <w:pPr>
-        <w:ind w:left="1800" w:hanging="360"/>
+        <w:ind w:left="1440" w:hanging="360"/>
       </w:pPr>
     </w:lvl>
     <w:lvl w:ilvl="2" w:tplc="4009001B" w:tentative="1">
@@ -2014,7 +3271,7 @@
       <w:lvlText w:val="%3."/>
       <w:lvlJc w:val="right"/>
       <w:pPr>
-        <w:ind w:left="2520" w:hanging="180"/>
+        <w:ind w:left="2160" w:hanging="180"/>
       </w:pPr>
     </w:lvl>
     <w:lvl w:ilvl="3" w:tplc="4009000F" w:tentative="1">
@@ -2023,7 +3280,7 @@
       <w:lvlText w:val="%4."/>
       <w:lvlJc w:val="left"/>
       <w:pPr>
-        <w:ind w:left="3240" w:hanging="360"/>
+        <w:ind w:left="2880" w:hanging="360"/>
       </w:pPr>
     </w:lvl>
     <w:lvl w:ilvl="4" w:tplc="40090019" w:tentative="1">
@@ -2032,7 +3289,7 @@
       <w:lvlText w:val="%5."/>
       <w:lvlJc w:val="left"/>
       <w:pPr>
-        <w:ind w:left="3960" w:hanging="360"/>
+        <w:ind w:left="3600" w:hanging="360"/>
       </w:pPr>
     </w:lvl>
     <w:lvl w:ilvl="5" w:tplc="4009001B" w:tentative="1">
@@ -2041,7 +3298,7 @@
       <w:lvlText w:val="%6."/>
       <w:lvlJc w:val="right"/>
       <w:pPr>
-        <w:ind w:left="4680" w:hanging="180"/>
+        <w:ind w:left="4320" w:hanging="180"/>
       </w:pPr>
     </w:lvl>
     <w:lvl w:ilvl="6" w:tplc="4009000F" w:tentative="1">
@@ -2050,7 +3307,7 @@
       <w:lvlText w:val="%7."/>
       <w:lvlJc w:val="left"/>
       <w:pPr>
-        <w:ind w:left="5400" w:hanging="360"/>
+        <w:ind w:left="5040" w:hanging="360"/>
       </w:pPr>
     </w:lvl>
     <w:lvl w:ilvl="7" w:tplc="40090019" w:tentative="1">
@@ -2059,7 +3316,7 @@
       <w:lvlText w:val="%8."/>
       <w:lvlJc w:val="left"/>
       <w:pPr>
-        <w:ind w:left="6120" w:hanging="360"/>
+        <w:ind w:left="5760" w:hanging="360"/>
       </w:pPr>
     </w:lvl>
     <w:lvl w:ilvl="8" w:tplc="4009001B" w:tentative="1">
@@ -2068,7 +3325,99 @@
       <w:lvlText w:val="%9."/>
       <w:lvlJc w:val="right"/>
       <w:pPr>
-        <w:ind w:left="6840" w:hanging="180"/>
+        <w:ind w:left="6480" w:hanging="180"/>
+      </w:pPr>
+    </w:lvl>
+  </w:abstractNum>
+  <w:abstractNum w:abstractNumId="19" w15:restartNumberingAfterBreak="0">
+    <w:nsid w:val="7CA51952"/>
+    <w:multiLevelType w:val="hybridMultilevel"/>
+    <w:tmpl w:val="71A8AF14"/>
+    <w:lvl w:ilvl="0" w:tplc="FFFFFFFF">
+      <w:start w:val="1"/>
+      <w:numFmt w:val="decimal"/>
+      <w:lvlText w:val="%1."/>
+      <w:lvlJc w:val="left"/>
+      <w:pPr>
+        <w:ind w:left="720" w:hanging="360"/>
+      </w:pPr>
+      <w:rPr>
+        <w:rFonts w:hint="default"/>
+      </w:rPr>
+    </w:lvl>
+    <w:lvl w:ilvl="1" w:tplc="40090001">
+      <w:start w:val="1"/>
+      <w:numFmt w:val="bullet"/>
+      <w:lvlText w:val=""/>
+      <w:lvlJc w:val="left"/>
+      <w:pPr>
+        <w:ind w:left="1440" w:hanging="360"/>
+      </w:pPr>
+      <w:rPr>
+        <w:rFonts w:ascii="Symbol" w:hAnsi="Symbol" w:hint="default"/>
+      </w:rPr>
+    </w:lvl>
+    <w:lvl w:ilvl="2" w:tplc="FFFFFFFF">
+      <w:start w:val="1"/>
+      <w:numFmt w:val="lowerRoman"/>
+      <w:lvlText w:val="%3."/>
+      <w:lvlJc w:val="right"/>
+      <w:pPr>
+        <w:ind w:left="2160" w:hanging="180"/>
+      </w:pPr>
+    </w:lvl>
+    <w:lvl w:ilvl="3" w:tplc="FFFFFFFF" w:tentative="1">
+      <w:start w:val="1"/>
+      <w:numFmt w:val="decimal"/>
+      <w:lvlText w:val="%4."/>
+      <w:lvlJc w:val="left"/>
+      <w:pPr>
+        <w:ind w:left="2880" w:hanging="360"/>
+      </w:pPr>
+    </w:lvl>
+    <w:lvl w:ilvl="4" w:tplc="FFFFFFFF" w:tentative="1">
+      <w:start w:val="1"/>
+      <w:numFmt w:val="lowerLetter"/>
+      <w:lvlText w:val="%5."/>
+      <w:lvlJc w:val="left"/>
+      <w:pPr>
+        <w:ind w:left="3600" w:hanging="360"/>
+      </w:pPr>
+    </w:lvl>
+    <w:lvl w:ilvl="5" w:tplc="FFFFFFFF" w:tentative="1">
+      <w:start w:val="1"/>
+      <w:numFmt w:val="lowerRoman"/>
+      <w:lvlText w:val="%6."/>
+      <w:lvlJc w:val="right"/>
+      <w:pPr>
+        <w:ind w:left="4320" w:hanging="180"/>
+      </w:pPr>
+    </w:lvl>
+    <w:lvl w:ilvl="6" w:tplc="FFFFFFFF" w:tentative="1">
+      <w:start w:val="1"/>
+      <w:numFmt w:val="decimal"/>
+      <w:lvlText w:val="%7."/>
+      <w:lvlJc w:val="left"/>
+      <w:pPr>
+        <w:ind w:left="5040" w:hanging="360"/>
+      </w:pPr>
+    </w:lvl>
+    <w:lvl w:ilvl="7" w:tplc="FFFFFFFF" w:tentative="1">
+      <w:start w:val="1"/>
+      <w:numFmt w:val="lowerLetter"/>
+      <w:lvlText w:val="%8."/>
+      <w:lvlJc w:val="left"/>
+      <w:pPr>
+        <w:ind w:left="5760" w:hanging="360"/>
+      </w:pPr>
+    </w:lvl>
+    <w:lvl w:ilvl="8" w:tplc="FFFFFFFF" w:tentative="1">
+      <w:start w:val="1"/>
+      <w:numFmt w:val="lowerRoman"/>
+      <w:lvlText w:val="%9."/>
+      <w:lvlJc w:val="right"/>
+      <w:pPr>
+        <w:ind w:left="6480" w:hanging="180"/>
       </w:pPr>
     </w:lvl>
   </w:abstractNum>
@@ -2100,7 +3449,7 @@
     <w:abstractNumId w:val="0"/>
   </w:num>
   <w:num w:numId="10" w16cid:durableId="1624769160">
-    <w:abstractNumId w:val="12"/>
+    <w:abstractNumId w:val="13"/>
   </w:num>
   <w:num w:numId="11" w16cid:durableId="380251214">
     <w:abstractNumId w:val="9"/>
@@ -2112,7 +3461,25 @@
     <w:abstractNumId w:val="11"/>
   </w:num>
   <w:num w:numId="14" w16cid:durableId="1563298065">
-    <w:abstractNumId w:val="13"/>
+    <w:abstractNumId w:val="18"/>
+  </w:num>
+  <w:num w:numId="15" w16cid:durableId="1344820331">
+    <w:abstractNumId w:val="15"/>
+  </w:num>
+  <w:num w:numId="16" w16cid:durableId="1133326201">
+    <w:abstractNumId w:val="14"/>
+  </w:num>
+  <w:num w:numId="17" w16cid:durableId="220292373">
+    <w:abstractNumId w:val="17"/>
+  </w:num>
+  <w:num w:numId="18" w16cid:durableId="1515221735">
+    <w:abstractNumId w:val="12"/>
+  </w:num>
+  <w:num w:numId="19" w16cid:durableId="704066589">
+    <w:abstractNumId w:val="16"/>
+  </w:num>
+  <w:num w:numId="20" w16cid:durableId="344938709">
+    <w:abstractNumId w:val="19"/>
   </w:num>
 </w:numbering>
 </file>
@@ -2543,7 +3910,7 @@
     <w:uiPriority w:val="9"/>
     <w:unhideWhenUsed/>
     <w:qFormat/>
-    <w:rsid w:val="00FC693F"/>
+    <w:rsid w:val="009E57AB"/>
     <w:pPr>
       <w:keepNext/>
       <w:keepLines/>
@@ -2554,9 +3921,9 @@
       <w:rFonts w:asciiTheme="majorHAnsi" w:eastAsiaTheme="majorEastAsia" w:hAnsiTheme="majorHAnsi" w:cstheme="majorBidi"/>
       <w:b/>
       <w:bCs/>
-      <w:color w:val="4F81BD" w:themeColor="accent1"/>
-      <w:sz w:val="26"/>
-      <w:szCs w:val="26"/>
+      <w:color w:val="EE0000"/>
+      <w:sz w:val="32"/>
+      <w:szCs w:val="32"/>
     </w:rPr>
   </w:style>
   <w:style w:type="paragraph" w:styleId="Heading3">
@@ -2821,14 +4188,14 @@
     <w:basedOn w:val="DefaultParagraphFont"/>
     <w:link w:val="Heading2"/>
     <w:uiPriority w:val="9"/>
-    <w:rsid w:val="00FC693F"/>
+    <w:rsid w:val="009E57AB"/>
     <w:rPr>
       <w:rFonts w:asciiTheme="majorHAnsi" w:eastAsiaTheme="majorEastAsia" w:hAnsiTheme="majorHAnsi" w:cstheme="majorBidi"/>
       <w:b/>
       <w:bCs/>
-      <w:color w:val="4F81BD" w:themeColor="accent1"/>
-      <w:sz w:val="26"/>
-      <w:szCs w:val="26"/>
+      <w:color w:val="EE0000"/>
+      <w:sz w:val="32"/>
+      <w:szCs w:val="32"/>
     </w:rPr>
   </w:style>
   <w:style w:type="character" w:customStyle="1" w:styleId="Heading3Char">
@@ -13499,6 +14866,41 @@
         <w:shd w:val="clear" w:color="auto" w:fill="FBCAA2" w:themeFill="accent6" w:themeFillTint="7F"/>
       </w:tcPr>
     </w:tblStylePr>
+  </w:style>
+  <w:style w:type="character" w:styleId="Hyperlink">
+    <w:name w:val="Hyperlink"/>
+    <w:basedOn w:val="DefaultParagraphFont"/>
+    <w:uiPriority w:val="99"/>
+    <w:unhideWhenUsed/>
+    <w:rsid w:val="009E57AB"/>
+    <w:rPr>
+      <w:color w:val="0000FF" w:themeColor="hyperlink"/>
+      <w:u w:val="single"/>
+    </w:rPr>
+  </w:style>
+  <w:style w:type="character" w:styleId="UnresolvedMention">
+    <w:name w:val="Unresolved Mention"/>
+    <w:basedOn w:val="DefaultParagraphFont"/>
+    <w:uiPriority w:val="99"/>
+    <w:semiHidden/>
+    <w:unhideWhenUsed/>
+    <w:rsid w:val="009E57AB"/>
+    <w:rPr>
+      <w:color w:val="605E5C"/>
+      <w:shd w:val="clear" w:color="auto" w:fill="E1DFDD"/>
+    </w:rPr>
+  </w:style>
+  <w:style w:type="character" w:styleId="FollowedHyperlink">
+    <w:name w:val="FollowedHyperlink"/>
+    <w:basedOn w:val="DefaultParagraphFont"/>
+    <w:uiPriority w:val="99"/>
+    <w:semiHidden/>
+    <w:unhideWhenUsed/>
+    <w:rsid w:val="00B02677"/>
+    <w:rPr>
+      <w:color w:val="800080" w:themeColor="followedHyperlink"/>
+      <w:u w:val="single"/>
+    </w:rPr>
   </w:style>
 </w:styles>
 </file>

</xml_diff>